<commit_message>
Update workshop documentation to include PRDs and clarify plans
</commit_message>
<xml_diff>
--- a/docs/workshop-tdd-adr-ai-assisted-development.docx
+++ b/docs/workshop-tdd-adr-ai-assisted-development.docx
@@ -240,14 +240,14 @@
         <w:tblLayout w:type="fixed"/>
       </w:tblPr>
       <w:tblGrid>
-        <w:gridCol w:w="2227"/>
-        <w:gridCol w:w="4964"/>
-        <w:gridCol w:w="2163"/>
+        <w:gridCol w:w="1789"/>
+        <w:gridCol w:w="5828"/>
+        <w:gridCol w:w="1738"/>
       </w:tblGrid>
       <w:tr>
         <w:tc>
           <w:tcPr>
-            <w:tcW w:type="dxa" w:w="2227"/>
+            <w:tcW w:type="dxa" w:w="1789"/>
             <w:shd w:val="clear" w:color="auto" w:fill="958561"/>
             <w:tcMar>
               <w:bottom w:w="85" w:type="dxa"/>
@@ -278,7 +278,7 @@
         </w:tc>
         <w:tc>
           <w:tcPr>
-            <w:tcW w:type="dxa" w:w="4964"/>
+            <w:tcW w:type="dxa" w:w="5828"/>
             <w:shd w:val="clear" w:color="auto" w:fill="958561"/>
             <w:tcMar>
               <w:bottom w:w="85" w:type="dxa"/>
@@ -309,7 +309,7 @@
         </w:tc>
         <w:tc>
           <w:tcPr>
-            <w:tcW w:type="dxa" w:w="2163"/>
+            <w:tcW w:type="dxa" w:w="1738"/>
             <w:shd w:val="clear" w:color="auto" w:fill="958561"/>
             <w:tcMar>
               <w:bottom w:w="85" w:type="dxa"/>
@@ -342,7 +342,7 @@
       <w:tr>
         <w:tc>
           <w:tcPr>
-            <w:tcW w:type="dxa" w:w="2227"/>
+            <w:tcW w:type="dxa" w:w="1789"/>
           </w:tcPr>
           <w:p>
             <w:pPr>
@@ -359,7 +359,7 @@
         </w:tc>
         <w:tc>
           <w:tcPr>
-            <w:tcW w:type="dxa" w:w="4964"/>
+            <w:tcW w:type="dxa" w:w="5828"/>
           </w:tcPr>
           <w:p>
             <w:pPr>
@@ -373,7 +373,7 @@
         </w:tc>
         <w:tc>
           <w:tcPr>
-            <w:tcW w:type="dxa" w:w="2163"/>
+            <w:tcW w:type="dxa" w:w="1738"/>
           </w:tcPr>
           <w:p>
             <w:pPr>
@@ -389,7 +389,7 @@
       <w:tr>
         <w:tc>
           <w:tcPr>
-            <w:tcW w:type="dxa" w:w="2227"/>
+            <w:tcW w:type="dxa" w:w="1789"/>
           </w:tcPr>
           <w:p>
             <w:pPr>
@@ -406,7 +406,7 @@
         </w:tc>
         <w:tc>
           <w:tcPr>
-            <w:tcW w:type="dxa" w:w="4964"/>
+            <w:tcW w:type="dxa" w:w="5828"/>
           </w:tcPr>
           <w:p>
             <w:pPr>
@@ -420,7 +420,7 @@
         </w:tc>
         <w:tc>
           <w:tcPr>
-            <w:tcW w:type="dxa" w:w="2163"/>
+            <w:tcW w:type="dxa" w:w="1738"/>
           </w:tcPr>
           <w:p>
             <w:pPr>
@@ -436,7 +436,54 @@
       <w:tr>
         <w:tc>
           <w:tcPr>
-            <w:tcW w:type="dxa" w:w="2227"/>
+            <w:tcW w:type="dxa" w:w="1789"/>
+          </w:tcPr>
+          <w:p>
+            <w:pPr>
+              <w:jc w:val="left"/>
+            </w:pPr>
+            <w:r/>
+            <w:r>
+              <w:rPr>
+                <w:b/>
+              </w:rPr>
+              <w:t>PRDs</w:t>
+            </w:r>
+          </w:p>
+        </w:tc>
+        <w:tc>
+          <w:tcPr>
+            <w:tcW w:type="dxa" w:w="5828"/>
+          </w:tcPr>
+          <w:p>
+            <w:pPr>
+              <w:jc w:val="left"/>
+            </w:pPr>
+            <w:r/>
+            <w:r>
+              <w:t>Product requirements: *wat* en *waarom* op feature-niveau</w:t>
+            </w:r>
+          </w:p>
+        </w:tc>
+        <w:tc>
+          <w:tcPr>
+            <w:tcW w:type="dxa" w:w="1738"/>
+          </w:tcPr>
+          <w:p>
+            <w:pPr>
+              <w:jc w:val="left"/>
+            </w:pPr>
+            <w:r/>
+            <w:r>
+              <w:t>`plans/`</w:t>
+            </w:r>
+          </w:p>
+        </w:tc>
+      </w:tr>
+      <w:tr>
+        <w:tc>
+          <w:tcPr>
+            <w:tcW w:type="dxa" w:w="1789"/>
           </w:tcPr>
           <w:p>
             <w:pPr>
@@ -453,7 +500,7 @@
         </w:tc>
         <w:tc>
           <w:tcPr>
-            <w:tcW w:type="dxa" w:w="4964"/>
+            <w:tcW w:type="dxa" w:w="5828"/>
           </w:tcPr>
           <w:p>
             <w:pPr>
@@ -461,13 +508,13 @@
             </w:pPr>
             <w:r/>
             <w:r>
-              <w:t>Scope, specs en voortgang</w:t>
+              <w:t>Technische scope, specs en voortgang</w:t>
             </w:r>
           </w:p>
         </w:tc>
         <w:tc>
           <w:tcPr>
-            <w:tcW w:type="dxa" w:w="2163"/>
+            <w:tcW w:type="dxa" w:w="1738"/>
           </w:tcPr>
           <w:p>
             <w:pPr>
@@ -485,6 +532,37 @@
       <w:pPr>
         <w:pStyle w:val="Standaard"/>
       </w:pPr>
+    </w:p>
+    <w:p>
+      <w:pPr>
+        <w:pStyle w:val="Standaard"/>
+      </w:pPr>
+      <w:r>
+        <w:rPr>
+          <w:b/>
+          <w:i/>
+        </w:rPr>
+        <w:t xml:space="preserve">Opmerking:</w:t>
+      </w:r>
+      <w:r>
+        <w:rPr>
+          <w:i/>
+        </w:rPr>
+        <w:t xml:space="preserve"> Sinds de oorspronkelijke versie van deze workshop is het systeem uitgebreid met </w:t>
+      </w:r>
+      <w:r>
+        <w:rPr>
+          <w:b/>
+          <w:i/>
+        </w:rPr>
+        <w:t xml:space="preserve">Product Requirements Documents (PRDs)</w:t>
+      </w:r>
+      <w:r>
+        <w:rPr>
+          <w:i/>
+        </w:rPr>
+        <w:t xml:space="preserve">. PRDs formaliseren de functionele eisen en het *waarom* op feature-niveau, vóórdat er een technisch plan wordt geschreven. Ze vormen de schakel tussen een idee en een implementatieplan, en voorkomen dat de AI (of een developer) begint te bouwen zonder helder gedefinieerde scope en doelen.</w:t>
+      </w:r>
     </w:p>
     <w:p>
       <w:pPr>
@@ -2117,14 +2195,14 @@
         <w:tblLayout w:type="fixed"/>
       </w:tblPr>
       <w:tblGrid>
-        <w:gridCol w:w="2227"/>
-        <w:gridCol w:w="4455"/>
-        <w:gridCol w:w="2673"/>
+        <w:gridCol w:w="2059"/>
+        <w:gridCol w:w="4825"/>
+        <w:gridCol w:w="2471"/>
       </w:tblGrid>
       <w:tr>
         <w:tc>
           <w:tcPr>
-            <w:tcW w:type="dxa" w:w="2227"/>
+            <w:tcW w:type="dxa" w:w="2059"/>
             <w:shd w:val="clear" w:color="auto" w:fill="958561"/>
             <w:tcMar>
               <w:bottom w:w="85" w:type="dxa"/>
@@ -2155,7 +2233,7 @@
         </w:tc>
         <w:tc>
           <w:tcPr>
-            <w:tcW w:type="dxa" w:w="4455"/>
+            <w:tcW w:type="dxa" w:w="4825"/>
             <w:shd w:val="clear" w:color="auto" w:fill="958561"/>
             <w:tcMar>
               <w:bottom w:w="85" w:type="dxa"/>
@@ -2186,7 +2264,7 @@
         </w:tc>
         <w:tc>
           <w:tcPr>
-            <w:tcW w:type="dxa" w:w="2673"/>
+            <w:tcW w:type="dxa" w:w="2471"/>
             <w:shd w:val="clear" w:color="auto" w:fill="958561"/>
             <w:tcMar>
               <w:bottom w:w="85" w:type="dxa"/>
@@ -2219,7 +2297,7 @@
       <w:tr>
         <w:tc>
           <w:tcPr>
-            <w:tcW w:type="dxa" w:w="2227"/>
+            <w:tcW w:type="dxa" w:w="2059"/>
           </w:tcPr>
           <w:p>
             <w:pPr>
@@ -2236,7 +2314,7 @@
         </w:tc>
         <w:tc>
           <w:tcPr>
-            <w:tcW w:type="dxa" w:w="4455"/>
+            <w:tcW w:type="dxa" w:w="4825"/>
           </w:tcPr>
           <w:p>
             <w:pPr>
@@ -2250,7 +2328,7 @@
         </w:tc>
         <w:tc>
           <w:tcPr>
-            <w:tcW w:type="dxa" w:w="2673"/>
+            <w:tcW w:type="dxa" w:w="2471"/>
           </w:tcPr>
           <w:p>
             <w:pPr>
@@ -2266,7 +2344,7 @@
       <w:tr>
         <w:tc>
           <w:tcPr>
-            <w:tcW w:type="dxa" w:w="2227"/>
+            <w:tcW w:type="dxa" w:w="2059"/>
           </w:tcPr>
           <w:p>
             <w:pPr>
@@ -2283,7 +2361,7 @@
         </w:tc>
         <w:tc>
           <w:tcPr>
-            <w:tcW w:type="dxa" w:w="4455"/>
+            <w:tcW w:type="dxa" w:w="4825"/>
           </w:tcPr>
           <w:p>
             <w:pPr>
@@ -2297,7 +2375,7 @@
         </w:tc>
         <w:tc>
           <w:tcPr>
-            <w:tcW w:type="dxa" w:w="2673"/>
+            <w:tcW w:type="dxa" w:w="2471"/>
           </w:tcPr>
           <w:p>
             <w:pPr>
@@ -2313,7 +2391,54 @@
       <w:tr>
         <w:tc>
           <w:tcPr>
-            <w:tcW w:type="dxa" w:w="2227"/>
+            <w:tcW w:type="dxa" w:w="2059"/>
+          </w:tcPr>
+          <w:p>
+            <w:pPr>
+              <w:jc w:val="left"/>
+            </w:pPr>
+            <w:r/>
+            <w:r>
+              <w:rPr>
+                <w:b/>
+              </w:rPr>
+              <w:t>PRD</w:t>
+            </w:r>
+          </w:p>
+        </w:tc>
+        <w:tc>
+          <w:tcPr>
+            <w:tcW w:type="dxa" w:w="4825"/>
+          </w:tcPr>
+          <w:p>
+            <w:pPr>
+              <w:jc w:val="left"/>
+            </w:pPr>
+            <w:r/>
+            <w:r>
+              <w:t>Formaliseert feature-eisen en doelen</w:t>
+            </w:r>
+          </w:p>
+        </w:tc>
+        <w:tc>
+          <w:tcPr>
+            <w:tcW w:type="dxa" w:w="2471"/>
+          </w:tcPr>
+          <w:p>
+            <w:pPr>
+              <w:jc w:val="left"/>
+            </w:pPr>
+            <w:r/>
+            <w:r>
+              <w:t>Ja (markdown in repo)</w:t>
+            </w:r>
+          </w:p>
+        </w:tc>
+      </w:tr>
+      <w:tr>
+        <w:tc>
+          <w:tcPr>
+            <w:tcW w:type="dxa" w:w="2059"/>
           </w:tcPr>
           <w:p>
             <w:pPr>
@@ -2330,7 +2455,7 @@
         </w:tc>
         <w:tc>
           <w:tcPr>
-            <w:tcW w:type="dxa" w:w="4455"/>
+            <w:tcW w:type="dxa" w:w="4825"/>
           </w:tcPr>
           <w:p>
             <w:pPr>
@@ -2338,13 +2463,13 @@
             </w:pPr>
             <w:r/>
             <w:r>
-              <w:t>Definieert scope, fases, specs</w:t>
+              <w:t>Definieert technische scope, fases, specs</w:t>
             </w:r>
           </w:p>
         </w:tc>
         <w:tc>
           <w:tcPr>
-            <w:tcW w:type="dxa" w:w="2673"/>
+            <w:tcW w:type="dxa" w:w="2471"/>
           </w:tcPr>
           <w:p>
             <w:pPr>
@@ -2360,7 +2485,7 @@
       <w:tr>
         <w:tc>
           <w:tcPr>
-            <w:tcW w:type="dxa" w:w="2227"/>
+            <w:tcW w:type="dxa" w:w="2059"/>
           </w:tcPr>
           <w:p>
             <w:pPr>
@@ -2377,7 +2502,7 @@
         </w:tc>
         <w:tc>
           <w:tcPr>
-            <w:tcW w:type="dxa" w:w="4455"/>
+            <w:tcW w:type="dxa" w:w="4825"/>
           </w:tcPr>
           <w:p>
             <w:pPr>
@@ -2391,7 +2516,7 @@
         </w:tc>
         <w:tc>
           <w:tcPr>
-            <w:tcW w:type="dxa" w:w="2673"/>
+            <w:tcW w:type="dxa" w:w="2471"/>
           </w:tcPr>
           <w:p>
             <w:pPr>
@@ -2415,7 +2540,7 @@
         <w:pStyle w:val="Standaard"/>
       </w:pPr>
       <w:r>
-        <w:t xml:space="preserve">De kracht zit in de combinatie: het plan definieert *wat* er gebouwd wordt, TDD verifieert *dat* het correct is, en ADRs leggen vast *waarom* het zo is. Samen vormen ze een systeem dat context rot voorkomt en consistente, betrouwbare AI-assisted development mogelijk maakt.</w:t>
+        <w:t xml:space="preserve">De kracht zit in de combinatie: de PRD definieert *wat* er gebouwd moet worden en *waarom*, het plan vertaalt dat naar technische specs, TDD verifieert *dat* het correct is, en ADRs leggen vast *waarom* technische keuzes zijn gemaakt. Samen vormen ze een systeem dat context rot voorkomt en consistente, betrouwbare AI-assisted development mogelijk maakt.</w:t>
       </w:r>
     </w:p>
     <w:p>

</xml_diff>

<commit_message>
Update workshop documents with new AI-assisted development resources
</commit_message>
<xml_diff>
--- a/docs/workshop-tdd-adr-ai-assisted-development.docx
+++ b/docs/workshop-tdd-adr-ai-assisted-development.docx
@@ -36,12 +36,22 @@
         <w:rPr/>
         <w:t>Datum:</w:t>
         <w:tab/>
+        <w:t>25 maart 2026</w:t>
+        <w:br/>
+        <w:t>Auteur:</w:t>
         <w:tab/>
-        <w:t>20 maart 2026</w:t>
-        <w:br/>
-        <w:t>Case study:</w:t>
-        <w:tab/>
-        <w:t>Mithril — PWA gebouwd met Claude Code</w:t>
+        <w:t>Bas de Kort</w:t>
+      </w:r>
+    </w:p>
+    <w:p>
+      <w:pPr>
+        <w:pStyle w:val="Normal"/>
+        <w:spacing w:before="0" w:after="0"/>
+        <w:contextualSpacing/>
+        <w:rPr/>
+      </w:pPr>
+      <w:r>
+        <w:rPr/>
       </w:r>
     </w:p>
     <w:p>
@@ -51,7 +61,7 @@
       </w:pPr>
       <w:r>
         <w:rPr/>
-        <w:t>Deel 1: Het Probleem — Context Rot</w:t>
+        <w:t>Deel 1: Het Probleem; Context Rot</w:t>
       </w:r>
     </w:p>
     <w:p>
@@ -61,7 +71,7 @@
       </w:pPr>
       <w:r>
         <w:rPr/>
-        <w:t>Wat is context rot?</w:t>
+        <w:t>AI heeft geheugenverlies</w:t>
       </w:r>
     </w:p>
     <w:p>
@@ -71,7 +81,7 @@
       </w:pPr>
       <w:r>
         <w:rPr/>
-        <w:t xml:space="preserve">AI coding assistants zoals Claude Code, GitHub Copilot en Cursor werken binnen een </w:t>
+        <w:t xml:space="preserve">AI coding assistants werken binnen een </w:t>
       </w:r>
       <w:r>
         <w:rPr>
@@ -81,7 +91,7 @@
       </w:r>
       <w:r>
         <w:rPr/>
-        <w:t xml:space="preserve"> — een beperkt geheugen dat alleen de huidige conversatie bevat. Elke keer dat je een nieuwe chat start, begint de AI met een blanco geheugen.</w:t>
+        <w:t>; een beperkt geheugen met een vaste maximale grootte. Elke nieuwe chat begint blanco.</w:t>
       </w:r>
     </w:p>
     <w:p>
@@ -89,131 +99,157 @@
         <w:pStyle w:val="Normal"/>
         <w:rPr/>
       </w:pPr>
+      <w:r>
+        <w:rPr/>
+        <w:t xml:space="preserve">Maar het probleem gaat verder dan alleen sessiewisselingen. Ook </w:t>
+      </w:r>
       <w:r>
         <w:rPr>
           <w:b/>
         </w:rPr>
-        <w:t>Context rot</w:t>
-      </w:r>
-      <w:r>
-        <w:rPr/>
-        <w:t xml:space="preserve"> is het fenomeen waarbij:</w:t>
+        <w:t>binnen een lopend gesprek</w:t>
+      </w:r>
+      <w:r>
+        <w:rPr/>
+        <w:t xml:space="preserve"> degradeert de context:</w:t>
       </w:r>
     </w:p>
     <w:p>
       <w:pPr>
         <w:pStyle w:val="ListParagraph"/>
-        <w:rPr/>
-      </w:pPr>
-      <w:r>
-        <w:rPr/>
-        <w:t>Eerdere architectuurbeslissingen verloren gaan bij een nieuwe sessie</w:t>
-      </w:r>
-    </w:p>
-    <w:p>
-      <w:pPr>
-        <w:pStyle w:val="ListParagraph"/>
-        <w:rPr/>
-      </w:pPr>
-      <w:r>
-        <w:rPr/>
-        <w:t>De AI dezelfde fouten opnieuw maakt die je in een vorige chat al had gecorrigeerd</w:t>
-      </w:r>
-    </w:p>
-    <w:p>
-      <w:pPr>
-        <w:pStyle w:val="ListParagraph"/>
-        <w:rPr/>
-      </w:pPr>
-      <w:r>
-        <w:rPr/>
-        <w:t>Code inconsistent wordt omdat de AI niet meer weet welke patronen eerder gekozen zijn</w:t>
-      </w:r>
-    </w:p>
-    <w:p>
-      <w:pPr>
-        <w:pStyle w:val="ListParagraph"/>
-        <w:rPr/>
-      </w:pPr>
-      <w:r>
-        <w:rPr/>
-        <w:t>"Waarom is dit zo?" niet meer te beantwoorden is — niet door jou, niet door de AI</w:t>
-      </w:r>
-    </w:p>
-    <w:p>
-      <w:pPr>
-        <w:pStyle w:val="Heading3"/>
-        <w:rPr/>
-      </w:pPr>
-      <w:r>
-        <w:rPr/>
-        <w:t>Waarom is dit een groot probleem?</w:t>
-      </w:r>
-    </w:p>
-    <w:p>
-      <w:pPr>
-        <w:pStyle w:val="Normal"/>
-        <w:rPr/>
-      </w:pPr>
-      <w:r>
-        <w:rPr/>
-        <w:t>Bij traditionele development zit de context in het hoofd van de developer. Bij AI-assisted development is de AI je "pair programmer" — maar eentje met geheugenverlies. Stel je voor dat je elke ochtend een nieuwe collega krijgt die:</w:t>
-      </w:r>
-    </w:p>
-    <w:p>
-      <w:pPr>
-        <w:pStyle w:val="ListParagraph"/>
-        <w:rPr/>
-      </w:pPr>
-      <w:r>
-        <w:rPr/>
-        <w:t>Niet weet welke afspraken er vorige week zijn gemaakt</w:t>
-      </w:r>
-    </w:p>
-    <w:p>
-      <w:pPr>
-        <w:pStyle w:val="ListParagraph"/>
-        <w:rPr/>
-      </w:pPr>
-      <w:r>
-        <w:rPr/>
-        <w:t>Niet begrijpt waarom bepaalde technische keuzes zijn gemaakt</w:t>
-      </w:r>
-    </w:p>
-    <w:p>
-      <w:pPr>
-        <w:pStyle w:val="ListParagraph"/>
-        <w:rPr/>
-      </w:pPr>
-      <w:r>
-        <w:rPr/>
-        <w:t>Dezelfde vragen stelt die je gisteren al hebt beantwoord</w:t>
-      </w:r>
-    </w:p>
-    <w:p>
-      <w:pPr>
-        <w:pStyle w:val="ListParagraph"/>
-        <w:rPr/>
-      </w:pPr>
-      <w:r>
-        <w:rPr/>
-        <w:t>Code schrijft die inconsistent is met wat er al staat</w:t>
-      </w:r>
-    </w:p>
-    <w:p>
-      <w:pPr>
-        <w:pStyle w:val="Normal"/>
         <w:rPr/>
       </w:pPr>
       <w:r>
         <w:rPr>
           <w:b/>
         </w:rPr>
-        <w:t>In Mithril</w:t>
-      </w:r>
-      <w:r>
-        <w:rPr/>
-        <w:t xml:space="preserve"> zou dit betekenen: 318 commits, maar bij elke nieuwe chat een risico op tegenstrijdige patronen, vergeten constraints, en dubbel werk.</w:t>
+        <w:t>Context compressie:</w:t>
+      </w:r>
+      <w:r>
+        <w:rPr/>
+        <w:t xml:space="preserve"> Wanneer een gesprek het window nadert, moet de AI oudere berichten samenvatten of laten vallen. Nuances, constraints en eerdere afspraken verdwijnen stilletjes.</w:t>
+      </w:r>
+    </w:p>
+    <w:p>
+      <w:pPr>
+        <w:pStyle w:val="ListParagraph"/>
+        <w:rPr/>
+      </w:pPr>
+      <w:r>
+        <w:rPr>
+          <w:b/>
+        </w:rPr>
+        <w:t>Attention decay:</w:t>
+      </w:r>
+      <w:r>
+        <w:rPr/>
+        <w:t xml:space="preserve"> Hoe meer tekst er in het window zit, hoe minder gewicht de AI geeft aan informatie die "ver weg" staat. Instructies van 20 berichten geleden worden effectief vergeten, ook al zijn ze technisch nog aanwezig.</w:t>
+      </w:r>
+    </w:p>
+    <w:p>
+      <w:pPr>
+        <w:pStyle w:val="ListParagraph"/>
+        <w:rPr/>
+      </w:pPr>
+      <w:r>
+        <w:rPr>
+          <w:b/>
+        </w:rPr>
+        <w:t>Hallucinaties:</w:t>
+      </w:r>
+      <w:r>
+        <w:rPr/>
+        <w:t xml:space="preserve"> Wanneer de relevante context verdwenen of verdund is, vult de AI de gaten met plausibel klinkende maar feitelijk onjuiste informatie. De AI *weet niet dat hij het niet meer weet*; hij genereert zelfverzekerd antwoorden op basis van incomplete context.</w:t>
+      </w:r>
+    </w:p>
+    <w:p>
+      <w:pPr>
+        <w:pStyle w:val="Normal"/>
+        <w:rPr/>
+      </w:pPr>
+      <w:r>
+        <w:rPr/>
+        <w:t xml:space="preserve">Het resultaat is </w:t>
+      </w:r>
+      <w:r>
+        <w:rPr>
+          <w:b/>
+        </w:rPr>
+        <w:t>context rot</w:t>
+      </w:r>
+      <w:r>
+        <w:rPr/>
+        <w:t>: een geleidelijk verval van de kwaliteit van AI-output naarmate de sessie langer duurt of tussen sessies door.</w:t>
+      </w:r>
+    </w:p>
+    <w:p>
+      <w:pPr>
+        <w:pStyle w:val="Normal"/>
+        <w:rPr/>
+      </w:pPr>
+      <w:r>
+        <w:rPr/>
+        <w:t>In de praktijk betekent dit:</w:t>
+      </w:r>
+    </w:p>
+    <w:p>
+      <w:pPr>
+        <w:pStyle w:val="ListParagraph"/>
+        <w:rPr/>
+      </w:pPr>
+      <w:r>
+        <w:rPr/>
+        <w:t>Architectuurbeslissingen gaan verloren (tussen sessies) of raken verdund (binnen een sessie)</w:t>
+      </w:r>
+    </w:p>
+    <w:p>
+      <w:pPr>
+        <w:pStyle w:val="ListParagraph"/>
+        <w:rPr/>
+      </w:pPr>
+      <w:r>
+        <w:rPr/>
+        <w:t>De AI maakt dezelfde fouten opnieuw</w:t>
+      </w:r>
+    </w:p>
+    <w:p>
+      <w:pPr>
+        <w:pStyle w:val="ListParagraph"/>
+        <w:rPr/>
+      </w:pPr>
+      <w:r>
+        <w:rPr/>
+        <w:t>Code wordt inconsistent omdat patronen vergeten worden</w:t>
+      </w:r>
+    </w:p>
+    <w:p>
+      <w:pPr>
+        <w:pStyle w:val="ListParagraph"/>
+        <w:rPr/>
+      </w:pPr>
+      <w:r>
+        <w:rPr/>
+        <w:t>"Waarom is dit zo?" is niet meer te beantwoorden; niet door jou, niet door de AI</w:t>
+      </w:r>
+    </w:p>
+    <w:p>
+      <w:pPr>
+        <w:pStyle w:val="ListParagraph"/>
+        <w:rPr/>
+      </w:pPr>
+      <w:r>
+        <w:rPr/>
+        <w:t>Na een lange sessie kan de AI zelfverzekerd code voorstellen die indruist tegen afspraken van eerder in datzelfde gesprek</w:t>
+      </w:r>
+    </w:p>
+    <w:p>
+      <w:pPr>
+        <w:pStyle w:val="Normal"/>
+        <w:rPr/>
+      </w:pPr>
+      <w:r>
+        <w:rPr/>
+        <w:t>Stel je voor dat je een collega hebt die scherp begint, maar gedurende de dag steeds meer vergeet; en het ergste is dat hij niet doorheeft dat hij dingen vergeet.</w:t>
       </w:r>
     </w:p>
     <w:p>
@@ -223,7 +259,19 @@
       </w:pPr>
       <w:r>
         <w:rPr/>
-        <w:t>De oplossing: externe context die de sessie overleeft</w:t>
+      </w:r>
+      <w:r>
+        <w:br w:type="page"/>
+      </w:r>
+    </w:p>
+    <w:p>
+      <w:pPr>
+        <w:pStyle w:val="Heading3"/>
+        <w:rPr/>
+      </w:pPr>
+      <w:r>
+        <w:rPr/>
+        <w:t>De oplossing: externaliseer context</w:t>
       </w:r>
     </w:p>
     <w:p>
@@ -233,7 +281,7 @@
       </w:pPr>
       <w:r>
         <w:rPr/>
-        <w:t>De AI mag dan zijn geheugen verliezen, maar bestanden in je repository niet. De sleutel is om context te externaliseren in drie lagen:</w:t>
+        <w:t>De AI vergeet, maar bestanden in je repository niet. De sleutel is context externaliseren in vier lagen:</w:t>
       </w:r>
     </w:p>
     <w:tbl>
@@ -252,15 +300,15 @@
         <w:tblLook w:val="04a0" w:noHBand="0" w:noVBand="1" w:firstColumn="1" w:lastRow="0" w:lastColumn="0" w:firstRow="1"/>
       </w:tblPr>
       <w:tblGrid>
-        <w:gridCol w:w="1788"/>
-        <w:gridCol w:w="5829"/>
-        <w:gridCol w:w="1739"/>
+        <w:gridCol w:w="3532"/>
+        <w:gridCol w:w="1623"/>
+        <w:gridCol w:w="4201"/>
       </w:tblGrid>
       <w:tr>
         <w:trPr/>
         <w:tc>
           <w:tcPr>
-            <w:tcW w:w="1788" w:type="dxa"/>
+            <w:tcW w:w="3532" w:type="dxa"/>
             <w:tcBorders/>
             <w:shd w:color="auto" w:fill="958561" w:val="clear"/>
           </w:tcPr>
@@ -295,7 +343,7 @@
         </w:tc>
         <w:tc>
           <w:tcPr>
-            <w:tcW w:w="5829" w:type="dxa"/>
+            <w:tcW w:w="1623" w:type="dxa"/>
             <w:tcBorders/>
             <w:shd w:color="auto" w:fill="958561" w:val="clear"/>
           </w:tcPr>
@@ -324,13 +372,13 @@
                 <w:szCs w:val="16"/>
                 <w:lang w:val="nl-NL" w:eastAsia="nl-NL" w:bidi="ar-SA"/>
               </w:rPr>
-              <w:t>Wat het vastlegt</w:t>
+              <w:t>Beantwoordt</w:t>
             </w:r>
           </w:p>
         </w:tc>
         <w:tc>
           <w:tcPr>
-            <w:tcW w:w="1739" w:type="dxa"/>
+            <w:tcW w:w="4201" w:type="dxa"/>
             <w:tcBorders/>
             <w:shd w:color="auto" w:fill="958561" w:val="clear"/>
           </w:tcPr>
@@ -359,7 +407,7 @@
                 <w:szCs w:val="16"/>
                 <w:lang w:val="nl-NL" w:eastAsia="nl-NL" w:bidi="ar-SA"/>
               </w:rPr>
-              <w:t>Waar het leeft</w:t>
+              <w:t>Wat het vastlegt</w:t>
             </w:r>
           </w:p>
         </w:tc>
@@ -368,7 +416,7 @@
         <w:trPr/>
         <w:tc>
           <w:tcPr>
-            <w:tcW w:w="1788" w:type="dxa"/>
+            <w:tcW w:w="3532" w:type="dxa"/>
             <w:tcBorders/>
             <w:tcMar>
               <w:bottom w:w="0" w:type="dxa"/>
@@ -398,13 +446,13 @@
                 <w:szCs w:val="20"/>
                 <w:lang w:val="nl-NL" w:eastAsia="nl-NL" w:bidi="ar-SA"/>
               </w:rPr>
-              <w:t>Tests (TDD)</w:t>
+              <w:t>Product Requirements Documents (PRDs)</w:t>
             </w:r>
           </w:p>
         </w:tc>
         <w:tc>
           <w:tcPr>
-            <w:tcW w:w="5829" w:type="dxa"/>
+            <w:tcW w:w="1623" w:type="dxa"/>
             <w:tcBorders/>
             <w:tcMar>
               <w:bottom w:w="0" w:type="dxa"/>
@@ -433,13 +481,13 @@
                 <w:szCs w:val="20"/>
                 <w:lang w:val="nl-NL" w:eastAsia="nl-NL" w:bidi="ar-SA"/>
               </w:rPr>
-              <w:t>Gedrag en contracten</w:t>
+              <w:t>*Wat* en *waarom*</w:t>
             </w:r>
           </w:p>
         </w:tc>
         <w:tc>
           <w:tcPr>
-            <w:tcW w:w="1739" w:type="dxa"/>
+            <w:tcW w:w="4201" w:type="dxa"/>
             <w:tcBorders/>
             <w:tcMar>
               <w:bottom w:w="0" w:type="dxa"/>
@@ -468,7 +516,7 @@
                 <w:szCs w:val="20"/>
                 <w:lang w:val="nl-NL" w:eastAsia="nl-NL" w:bidi="ar-SA"/>
               </w:rPr>
-              <w:t>`tests/`</w:t>
+              <w:t>Feature-eisen, doelen en acceptatiecriteria</w:t>
             </w:r>
           </w:p>
         </w:tc>
@@ -477,7 +525,7 @@
         <w:trPr/>
         <w:tc>
           <w:tcPr>
-            <w:tcW w:w="1788" w:type="dxa"/>
+            <w:tcW w:w="3532" w:type="dxa"/>
             <w:tcBorders/>
             <w:tcMar>
               <w:bottom w:w="0" w:type="dxa"/>
@@ -507,13 +555,13 @@
                 <w:szCs w:val="20"/>
                 <w:lang w:val="nl-NL" w:eastAsia="nl-NL" w:bidi="ar-SA"/>
               </w:rPr>
-              <w:t>ADRs</w:t>
+              <w:t>Plans</w:t>
             </w:r>
           </w:p>
         </w:tc>
         <w:tc>
           <w:tcPr>
-            <w:tcW w:w="5829" w:type="dxa"/>
+            <w:tcW w:w="1623" w:type="dxa"/>
             <w:tcBorders/>
             <w:tcMar>
               <w:bottom w:w="0" w:type="dxa"/>
@@ -542,13 +590,13 @@
                 <w:szCs w:val="20"/>
                 <w:lang w:val="nl-NL" w:eastAsia="nl-NL" w:bidi="ar-SA"/>
               </w:rPr>
-              <w:t>Architectuurbeslissingen en de *waarom*</w:t>
+              <w:t>*Hoe*</w:t>
             </w:r>
           </w:p>
         </w:tc>
         <w:tc>
           <w:tcPr>
-            <w:tcW w:w="1739" w:type="dxa"/>
+            <w:tcW w:w="4201" w:type="dxa"/>
             <w:tcBorders/>
             <w:tcMar>
               <w:bottom w:w="0" w:type="dxa"/>
@@ -577,7 +625,7 @@
                 <w:szCs w:val="20"/>
                 <w:lang w:val="nl-NL" w:eastAsia="nl-NL" w:bidi="ar-SA"/>
               </w:rPr>
-              <w:t>`logs/decisions/`</w:t>
+              <w:t>Technische scope, fases en voortgang</w:t>
             </w:r>
           </w:p>
         </w:tc>
@@ -586,7 +634,7 @@
         <w:trPr/>
         <w:tc>
           <w:tcPr>
-            <w:tcW w:w="1788" w:type="dxa"/>
+            <w:tcW w:w="3532" w:type="dxa"/>
             <w:tcBorders/>
             <w:tcMar>
               <w:bottom w:w="0" w:type="dxa"/>
@@ -616,13 +664,13 @@
                 <w:szCs w:val="20"/>
                 <w:lang w:val="nl-NL" w:eastAsia="nl-NL" w:bidi="ar-SA"/>
               </w:rPr>
-              <w:t>PRDs</w:t>
+              <w:t>Test-Driven Development (TDD)</w:t>
             </w:r>
           </w:p>
         </w:tc>
         <w:tc>
           <w:tcPr>
-            <w:tcW w:w="5829" w:type="dxa"/>
+            <w:tcW w:w="1623" w:type="dxa"/>
             <w:tcBorders/>
             <w:tcMar>
               <w:bottom w:w="0" w:type="dxa"/>
@@ -651,13 +699,13 @@
                 <w:szCs w:val="20"/>
                 <w:lang w:val="nl-NL" w:eastAsia="nl-NL" w:bidi="ar-SA"/>
               </w:rPr>
-              <w:t>Product requirements: *wat* en *waarom* op feature-niveau</w:t>
+              <w:t>*Werkt het*</w:t>
             </w:r>
           </w:p>
         </w:tc>
         <w:tc>
           <w:tcPr>
-            <w:tcW w:w="1739" w:type="dxa"/>
+            <w:tcW w:w="4201" w:type="dxa"/>
             <w:tcBorders/>
             <w:tcMar>
               <w:bottom w:w="0" w:type="dxa"/>
@@ -686,7 +734,7 @@
                 <w:szCs w:val="20"/>
                 <w:lang w:val="nl-NL" w:eastAsia="nl-NL" w:bidi="ar-SA"/>
               </w:rPr>
-              <w:t>`plans/`</w:t>
+              <w:t>Gedrag, contracten en regressiebeveiliging</w:t>
             </w:r>
           </w:p>
         </w:tc>
@@ -695,7 +743,7 @@
         <w:trPr/>
         <w:tc>
           <w:tcPr>
-            <w:tcW w:w="1788" w:type="dxa"/>
+            <w:tcW w:w="3532" w:type="dxa"/>
             <w:tcBorders/>
             <w:tcMar>
               <w:bottom w:w="0" w:type="dxa"/>
@@ -725,13 +773,13 @@
                 <w:szCs w:val="20"/>
                 <w:lang w:val="nl-NL" w:eastAsia="nl-NL" w:bidi="ar-SA"/>
               </w:rPr>
-              <w:t>Plans</w:t>
+              <w:t>Architecture Decision Records (ADRs)</w:t>
             </w:r>
           </w:p>
         </w:tc>
         <w:tc>
           <w:tcPr>
-            <w:tcW w:w="5829" w:type="dxa"/>
+            <w:tcW w:w="1623" w:type="dxa"/>
             <w:tcBorders/>
             <w:tcMar>
               <w:bottom w:w="0" w:type="dxa"/>
@@ -760,13 +808,13 @@
                 <w:szCs w:val="20"/>
                 <w:lang w:val="nl-NL" w:eastAsia="nl-NL" w:bidi="ar-SA"/>
               </w:rPr>
-              <w:t>Technische scope, specs en voortgang</w:t>
+              <w:t>*Waarom zo*</w:t>
             </w:r>
           </w:p>
         </w:tc>
         <w:tc>
           <w:tcPr>
-            <w:tcW w:w="1739" w:type="dxa"/>
+            <w:tcW w:w="4201" w:type="dxa"/>
             <w:tcBorders/>
             <w:tcMar>
               <w:bottom w:w="0" w:type="dxa"/>
@@ -795,7 +843,7 @@
                 <w:szCs w:val="20"/>
                 <w:lang w:val="nl-NL" w:eastAsia="nl-NL" w:bidi="ar-SA"/>
               </w:rPr>
-              <w:t>`plans/`</w:t>
+              <w:t>Architectuurbeslissingen en hun onderbouwing</w:t>
             </w:r>
           </w:p>
         </w:tc>
@@ -812,218 +860,92 @@
     </w:p>
     <w:p>
       <w:pPr>
+        <w:pStyle w:val="Heading2"/>
+        <w:rPr/>
+      </w:pPr>
+      <w:r>
+        <w:rPr/>
+      </w:r>
+      <w:r>
+        <w:br w:type="page"/>
+      </w:r>
+    </w:p>
+    <w:p>
+      <w:pPr>
+        <w:pStyle w:val="Heading2"/>
+        <w:rPr/>
+      </w:pPr>
+      <w:r>
+        <w:rPr/>
+        <w:t>Deel 2: De Vier Lagen in de Praktijk</w:t>
+      </w:r>
+    </w:p>
+    <w:p>
+      <w:pPr>
+        <w:pStyle w:val="Heading3"/>
+        <w:rPr/>
+      </w:pPr>
+      <w:r>
+        <w:rPr/>
+        <w:t>Laag 1: PRDs; de opdracht</w:t>
+      </w:r>
+    </w:p>
+    <w:p>
+      <w:pPr>
         <w:pStyle w:val="Normal"/>
         <w:rPr/>
       </w:pPr>
       <w:r>
-        <w:rPr>
-          <w:b/>
-          <w:i/>
-        </w:rPr>
-        <w:t>Opmerking:</w:t>
-      </w:r>
-      <w:r>
-        <w:rPr>
-          <w:i/>
-        </w:rPr>
-        <w:t xml:space="preserve"> Sinds de oorspronkelijke versie van deze workshop is het systeem uitgebreid met </w:t>
-      </w:r>
-      <w:r>
-        <w:rPr>
-          <w:b/>
-          <w:i/>
-        </w:rPr>
-        <w:t>Product Requirements Documents (PRDs)</w:t>
-      </w:r>
-      <w:r>
-        <w:rPr>
-          <w:i/>
-        </w:rPr>
-        <w:t>. PRDs formaliseren de functionele eisen en het *waarom* op feature-niveau, vóórdat er een technisch plan wordt geschreven. Ze vormen de schakel tussen een idee en een implementatieplan, en voorkomen dat de AI (of een developer) begint te bouwen zonder helder gedefinieerde scope en doelen.</w:t>
-      </w:r>
-    </w:p>
-    <w:p>
-      <w:pPr>
-        <w:pStyle w:val="Heading2"/>
-        <w:rPr/>
-      </w:pPr>
-      <w:r>
-        <w:rPr/>
-      </w:r>
-      <w:r>
-        <w:br w:type="page"/>
-      </w:r>
-    </w:p>
-    <w:p>
-      <w:pPr>
-        <w:pStyle w:val="Heading2"/>
-        <w:rPr/>
-      </w:pPr>
-      <w:r>
-        <w:rPr/>
-        <w:t>Deel 2: Test-Driven Development met AI</w:t>
-      </w:r>
-    </w:p>
-    <w:p>
-      <w:pPr>
-        <w:pStyle w:val="Heading3"/>
-        <w:rPr/>
-      </w:pPr>
-      <w:r>
-        <w:rPr/>
-        <w:t>Waarom TDD essentieel is bij AI-assisted development</w:t>
-      </w:r>
-    </w:p>
-    <w:p>
-      <w:pPr>
-        <w:pStyle w:val="Normal"/>
-        <w:rPr/>
-      </w:pPr>
-      <w:r>
-        <w:rPr/>
-        <w:t xml:space="preserve">TDD is geen "nice to have" bij AI-assisted development — het is een </w:t>
-      </w:r>
+        <w:rPr/>
+        <w:t>Alles begint met de vraag: *wat* gaan we bouwen en *waarom*? Een PRD formaliseert dat:</w:t>
+      </w:r>
+    </w:p>
+    <w:p>
+      <w:pPr>
+        <w:pStyle w:val="ListParagraph"/>
+        <w:rPr/>
+      </w:pPr>
       <w:r>
         <w:rPr>
           <w:b/>
         </w:rPr>
-        <w:t>veiligheidsnet dat voorkomt dat de AI je codebase sloopt</w:t>
-      </w:r>
-      <w:r>
-        <w:rPr/>
-        <w:t>.</w:t>
-      </w:r>
-    </w:p>
-    <w:p>
-      <w:pPr>
-        <w:pStyle w:val="Normal"/>
-        <w:rPr/>
-      </w:pPr>
-      <w:r>
-        <w:rPr/>
-        <w:t>Zonder TDD:</w:t>
+        <w:t>Doel</w:t>
+      </w:r>
+      <w:r>
+        <w:rPr/>
+        <w:t>; welk probleem lost dit op?</w:t>
       </w:r>
     </w:p>
     <w:p>
       <w:pPr>
         <w:pStyle w:val="ListParagraph"/>
-        <w:rPr/>
-      </w:pPr>
-      <w:r>
-        <w:rPr/>
-        <w:t>De AI schrijft code die "klopt" in isolatie, maar bestaande functionaliteit breekt</w:t>
-      </w:r>
-    </w:p>
-    <w:p>
-      <w:pPr>
-        <w:pStyle w:val="ListParagraph"/>
-        <w:rPr/>
-      </w:pPr>
-      <w:r>
-        <w:rPr/>
-        <w:t>Je merkt regressies pas veel later (of helemaal niet)</w:t>
-      </w:r>
-    </w:p>
-    <w:p>
-      <w:pPr>
-        <w:pStyle w:val="ListParagraph"/>
-        <w:rPr/>
-      </w:pPr>
-      <w:r>
-        <w:rPr/>
-        <w:t>Bij elke nieuwe sessie heb je geen garantie dat de AI de bestaande contracten respecteert</w:t>
-      </w:r>
-    </w:p>
-    <w:p>
-      <w:pPr>
-        <w:pStyle w:val="Normal"/>
-        <w:rPr/>
-      </w:pPr>
-      <w:r>
-        <w:rPr/>
-        <w:t>Met TDD:</w:t>
-      </w:r>
-    </w:p>
-    <w:p>
-      <w:pPr>
-        <w:pStyle w:val="ListParagraph"/>
-        <w:rPr/>
-      </w:pPr>
-      <w:r>
-        <w:rPr/>
-        <w:t>Tests beschrijven het verwachte gedrag — de AI leest ze en begrijpt de contracten</w:t>
-      </w:r>
-    </w:p>
-    <w:p>
-      <w:pPr>
-        <w:pStyle w:val="ListParagraph"/>
-        <w:rPr/>
-      </w:pPr>
-      <w:r>
-        <w:rPr/>
-        <w:t>Regressies worden direct gevangen</w:t>
-      </w:r>
-    </w:p>
-    <w:p>
-      <w:pPr>
-        <w:pStyle w:val="ListParagraph"/>
-        <w:rPr/>
-      </w:pPr>
-      <w:r>
-        <w:rPr/>
-        <w:t>De test suite is een levende specificatie die elke nieuwe sessie overleeft</w:t>
-      </w:r>
-    </w:p>
-    <w:p>
-      <w:pPr>
-        <w:pStyle w:val="Heading3"/>
-        <w:rPr/>
-      </w:pPr>
-      <w:r>
-        <w:rPr/>
-        <w:t>Het Red-Green-Refactor principe</w:t>
-      </w:r>
-    </w:p>
-    <w:p>
-      <w:pPr>
-        <w:pStyle w:val="Heading3"/>
-        <w:rPr/>
-      </w:pPr>
-      <w:r>
-        <w:rPr/>
-        <w:t>Case study: HasFollowUp trait bug (ADR-001)</w:t>
-      </w:r>
-    </w:p>
-    <w:p>
-      <w:pPr>
-        <w:pStyle w:val="Normal"/>
         <w:rPr/>
       </w:pPr>
       <w:r>
         <w:rPr>
           <w:b/>
         </w:rPr>
-        <w:t>Situatie:</w:t>
-      </w:r>
-      <w:r>
-        <w:rPr/>
-        <w:t xml:space="preserve"> Tijdens het schrijven van tests voor de `HasFollowUp` trait ontdekte de TDD-cyclus een design bug die bij normale development onopgemerkt was gebleven.</w:t>
-      </w:r>
-    </w:p>
-    <w:p>
-      <w:pPr>
-        <w:pStyle w:val="Normal"/>
-        <w:rPr/>
-      </w:pPr>
-      <w:r>
-        <w:rPr/>
-        <w:t xml:space="preserve">De trait definieerde scopes (`scopeOverdue`, `scopeDueToday`) die direct kolommen `follow_up_date` en `status` bevroegen. Maar die kolommen bestaan alleen op de `follow_ups` tabel — niet op `tasks` of `team_members` die de trait gebruiken. </w:t>
-      </w:r>
+        <w:t>Scope</w:t>
+      </w:r>
+      <w:r>
+        <w:rPr/>
+        <w:t>; wat is in en out of scope?</w:t>
+      </w:r>
+    </w:p>
+    <w:p>
+      <w:pPr>
+        <w:pStyle w:val="ListParagraph"/>
+        <w:rPr/>
+      </w:pPr>
       <w:r>
         <w:rPr>
           <w:b/>
         </w:rPr>
-        <w:t>Runtime SQL errors gegarandeerd.</w:t>
+        <w:t>Acceptatiecriteria</w:t>
+      </w:r>
+      <w:r>
+        <w:rPr/>
+        <w:t>; wanneer is het klaar?</w:t>
       </w:r>
     </w:p>
     <w:p>
@@ -1032,90 +954,8 @@
         <w:rPr/>
       </w:pPr>
       <w:r>
-        <w:rPr>
-          <w:b/>
-        </w:rPr>
-        <w:t>Hoe TDD dit ving:</w:t>
-      </w:r>
-    </w:p>
-    <w:p>
-      <w:pPr>
-        <w:pStyle w:val="ListParagraph"/>
-        <w:rPr/>
-      </w:pPr>
-      <w:r>
-        <w:rPr>
-          <w:b/>
-        </w:rPr>
-        <w:t>RED</w:t>
-      </w:r>
-      <w:r>
-        <w:rPr/>
-        <w:t xml:space="preserve"> — Tests geschreven voor `Task::withOverdueFollowUps()` scope</w:t>
-      </w:r>
-    </w:p>
-    <w:p>
-      <w:pPr>
-        <w:pStyle w:val="ListParagraph"/>
-        <w:rPr/>
-      </w:pPr>
-      <w:r>
-        <w:rPr>
-          <w:b/>
-        </w:rPr>
-        <w:t>Test faalde</w:t>
-      </w:r>
-      <w:r>
-        <w:rPr/>
-        <w:t xml:space="preserve"> — niet omdat de implementatie fout was, maar omdat het hele design fout was</w:t>
-      </w:r>
-    </w:p>
-    <w:p>
-      <w:pPr>
-        <w:pStyle w:val="ListParagraph"/>
-        <w:rPr/>
-      </w:pPr>
-      <w:r>
-        <w:rPr>
-          <w:b/>
-        </w:rPr>
-        <w:t>Beslissing</w:t>
-      </w:r>
-      <w:r>
-        <w:rPr/>
-        <w:t xml:space="preserve"> — Scopes herschreven naar `whereHas`-based queries (gedocumenteerd in ADR-001)</w:t>
-      </w:r>
-    </w:p>
-    <w:p>
-      <w:pPr>
-        <w:pStyle w:val="ListParagraph"/>
-        <w:rPr/>
-      </w:pPr>
-      <w:r>
-        <w:rPr>
-          <w:b/>
-        </w:rPr>
-        <w:t>GREEN</w:t>
-      </w:r>
-      <w:r>
-        <w:rPr/>
-        <w:t xml:space="preserve"> — Nieuwe implementatie passeert alle tests</w:t>
-      </w:r>
-    </w:p>
-    <w:p>
-      <w:pPr>
-        <w:pStyle w:val="ListParagraph"/>
-        <w:rPr/>
-      </w:pPr>
-      <w:r>
-        <w:rPr>
-          <w:b/>
-        </w:rPr>
-        <w:t>Resultaat</w:t>
-      </w:r>
-      <w:r>
-        <w:rPr/>
-        <w:t xml:space="preserve"> — Bug gevonden voordat er ook maar een regel productcode was geschreven</w:t>
+        <w:rPr/>
+        <w:t>Zonder PRD begint de AI (en soms de developer) te bouwen op basis van aannames. De PRD is het contract tussen het idee en de implementatie; het voorkomt dat er een technisch plan wordt geschreven voor iets dat nog niet goed gedefinieerd is.</w:t>
       </w:r>
     </w:p>
     <w:p>
@@ -1134,7 +974,7 @@
         <w:rPr>
           <w:i/>
         </w:rPr>
-        <w:t xml:space="preserve"> De tests vonden de bug. Niet de AI, niet code review, niet een QA-engineer. De test faalde, en dat dwong een redesign af voordat de fout in productie kon belanden.</w:t>
+        <w:t xml:space="preserve"> Een PRD hoeft niet zwaar te zijn. Zelfs een half A4 met doel, scope en 5 acceptatiecriteria bespaart uren aan verkeerde implementatie.</w:t>
       </w:r>
     </w:p>
     <w:p>
@@ -1144,7 +984,7 @@
       </w:pPr>
       <w:r>
         <w:rPr/>
-        <w:t>De TDD skill in de praktijk</w:t>
+        <w:t>Laag 2: Het Plan; de vertaling</w:t>
       </w:r>
     </w:p>
     <w:p>
@@ -1154,7 +994,37 @@
       </w:pPr>
       <w:r>
         <w:rPr/>
-        <w:t>De `/bdk-tdd` skill dwingt de red-green-refactor cyclus af bij elke implementatie:</w:t>
+        <w:t>Met een PRD in de hand is de volgende stap: *hoe* gaan we dit bouwen? Het plan vertaalt PRD-criteria naar technische specs:</w:t>
+      </w:r>
+    </w:p>
+    <w:p>
+      <w:pPr>
+        <w:pStyle w:val="ListParagraph"/>
+        <w:rPr/>
+      </w:pPr>
+      <w:r>
+        <w:rPr/>
+        <w:t>Deelt werk op in fases die in een sessie passen</w:t>
+      </w:r>
+    </w:p>
+    <w:p>
+      <w:pPr>
+        <w:pStyle w:val="ListParagraph"/>
+        <w:rPr/>
+      </w:pPr>
+      <w:r>
+        <w:rPr/>
+        <w:t>Maakt elke spec testbaar (directe input voor TDD)</w:t>
+      </w:r>
+    </w:p>
+    <w:p>
+      <w:pPr>
+        <w:pStyle w:val="ListParagraph"/>
+        <w:rPr/>
+      </w:pPr>
+      <w:r>
+        <w:rPr/>
+        <w:t>Houdt voortgang bij en legt vast wat *out of scope* is</w:t>
       </w:r>
     </w:p>
     <w:p>
@@ -1162,15 +1032,170 @@
         <w:pStyle w:val="Normal"/>
         <w:rPr/>
       </w:pPr>
+      <w:r>
+        <w:rPr/>
+        <w:t>Het plan is ook een levend document. Tijdens de implementatie van recurring tasks ontdekte TDD een event dispatch gap die niet in het oorspronkelijke plan stond. Het plan werd bijgewerkt met een nieuwe Phase 0, en een ADR geschreven (ADR-013).</w:t>
+      </w:r>
+    </w:p>
+    <w:p>
+      <w:pPr>
+        <w:pStyle w:val="Heading3"/>
+        <w:rPr/>
+      </w:pPr>
+      <w:r>
+        <w:rPr/>
+        <w:t>Laag 3: TDD; het veiligheidsnet</w:t>
+      </w:r>
+    </w:p>
+    <w:p>
+      <w:pPr>
+        <w:pStyle w:val="Normal"/>
+        <w:rPr/>
+      </w:pPr>
+      <w:r>
+        <w:rPr/>
+        <w:t xml:space="preserve">De specs uit het plan worden tests. TDD is geen "nice to have" bij AI-assisted development; het is het </w:t>
+      </w:r>
       <w:r>
         <w:rPr>
           <w:b/>
         </w:rPr>
-        <w:t>Belangrijk:</w:t>
-      </w:r>
-      <w:r>
-        <w:rPr/>
-        <w:t xml:space="preserve"> De skill vertelt de AI expliciet dat een test die meteen slaagt verdacht is — het test dan bestaand gedrag (overbodig) of test niet wat je denkt (fout).</w:t>
+        <w:t>veiligheidsnet dat voorkomt dat de AI je codebase sloopt</w:t>
+      </w:r>
+      <w:r>
+        <w:rPr/>
+        <w:t>.</w:t>
+      </w:r>
+    </w:p>
+    <w:p>
+      <w:pPr>
+        <w:pStyle w:val="Normal"/>
+        <w:rPr/>
+      </w:pPr>
+      <w:r>
+        <w:rPr/>
+        <w:t>Zonder TDD merk je niet dat de AI in sessie 5 iets heeft gebroken dat in sessie 2 werkte. Met TDD worden regressies direct gevangen, en de test suite vormt een levende specificatie die elke sessie overleeft.</w:t>
+      </w:r>
+    </w:p>
+    <w:p>
+      <w:pPr>
+        <w:pStyle w:val="Normal"/>
+        <w:rPr/>
+      </w:pPr>
+      <w:r>
+        <w:rPr>
+          <w:b/>
+        </w:rPr>
+        <w:t>Red-Green-Refactor:</w:t>
+      </w:r>
+    </w:p>
+    <w:p>
+      <w:pPr>
+        <w:pStyle w:val="ListParagraph"/>
+        <w:rPr/>
+      </w:pPr>
+      <w:r>
+        <w:rPr>
+          <w:b/>
+        </w:rPr>
+        <w:t>RED</w:t>
+      </w:r>
+      <w:r>
+        <w:rPr/>
+        <w:t>; schrijf een falende test die het gewenste gedrag beschrijft</w:t>
+      </w:r>
+    </w:p>
+    <w:p>
+      <w:pPr>
+        <w:pStyle w:val="ListParagraph"/>
+        <w:rPr/>
+      </w:pPr>
+      <w:r>
+        <w:rPr>
+          <w:b/>
+        </w:rPr>
+        <w:t>GREEN</w:t>
+      </w:r>
+      <w:r>
+        <w:rPr/>
+        <w:t>; schrijf de minimale code om de test te laten slagen</w:t>
+      </w:r>
+    </w:p>
+    <w:p>
+      <w:pPr>
+        <w:pStyle w:val="ListParagraph"/>
+        <w:rPr/>
+      </w:pPr>
+      <w:r>
+        <w:rPr>
+          <w:b/>
+        </w:rPr>
+        <w:t>REFACTOR</w:t>
+      </w:r>
+      <w:r>
+        <w:rPr/>
+        <w:t>; verbeter de code met het vangnet van groene tests</w:t>
+      </w:r>
+    </w:p>
+    <w:p>
+      <w:pPr>
+        <w:pStyle w:val="Normal"/>
+        <w:rPr/>
+      </w:pPr>
+      <w:r>
+        <w:rPr>
+          <w:b/>
+        </w:rPr>
+        <w:t>Case study: HasFollowUp trait (ADR-001)</w:t>
+      </w:r>
+    </w:p>
+    <w:p>
+      <w:pPr>
+        <w:pStyle w:val="Normal"/>
+        <w:rPr/>
+      </w:pPr>
+      <w:r>
+        <w:rPr/>
+        <w:t>De `HasFollowUp` trait definieerde scopes die direct kolommen `follow_up_date` en `status` bevroegen. Maar die kolommen bestaan alleen op de `follow_ups` tabel; niet op `tasks` of `team_members` die de trait gebruiken. Runtime SQL errors gegarandeerd.</w:t>
+      </w:r>
+    </w:p>
+    <w:p>
+      <w:pPr>
+        <w:pStyle w:val="Normal"/>
+        <w:rPr/>
+      </w:pPr>
+      <w:r>
+        <w:rPr/>
+        <w:t xml:space="preserve">TDD ving dit: de test faalde niet omdat de implementatie fout was, maar omdat het hele </w:t>
+      </w:r>
+      <w:r>
+        <w:rPr>
+          <w:b/>
+        </w:rPr>
+        <w:t>design</w:t>
+      </w:r>
+      <w:r>
+        <w:rPr/>
+        <w:t xml:space="preserve"> fout was. Scopes werden herschreven naar `whereHas`-based queries. De bug was gevonden voordat er ook maar een regel productcode was geschreven.</w:t>
+      </w:r>
+    </w:p>
+    <w:p>
+      <w:pPr>
+        <w:pStyle w:val="Normal"/>
+        <w:rPr/>
+      </w:pPr>
+      <w:r>
+        <w:rPr>
+          <w:b/>
+          <w:i/>
+        </w:rPr>
+        <w:t>Les:</w:t>
+      </w:r>
+      <w:r>
+        <w:rPr>
+          <w:i/>
+        </w:rPr>
+        <w:t xml:space="preserve"> De tests vonden de bug. Niet de AI, niet code review, niet QA. De falende test dwong een redesign af.</w:t>
       </w:r>
     </w:p>
     <w:p>
@@ -1180,9 +1205,172 @@
       </w:pPr>
       <w:r>
         <w:rPr/>
-      </w:r>
-      <w:r>
-        <w:br w:type="page"/>
+        <w:t>Laag 4: ADRs; het geheugen</w:t>
+      </w:r>
+    </w:p>
+    <w:p>
+      <w:pPr>
+        <w:pStyle w:val="Normal"/>
+        <w:rPr/>
+      </w:pPr>
+      <w:r>
+        <w:rPr/>
+        <w:t>Tijdens het bouwen worden beslissingen genomen die afwijken van het plan, of die niet-triviale trade-offs bevatten. Een ADR documenteert drie dingen:</w:t>
+      </w:r>
+    </w:p>
+    <w:p>
+      <w:pPr>
+        <w:pStyle w:val="ListParagraph"/>
+        <w:rPr/>
+      </w:pPr>
+      <w:r>
+        <w:rPr>
+          <w:b/>
+        </w:rPr>
+        <w:t>Context</w:t>
+      </w:r>
+      <w:r>
+        <w:rPr/>
+        <w:t>; wat was het probleem?</w:t>
+      </w:r>
+    </w:p>
+    <w:p>
+      <w:pPr>
+        <w:pStyle w:val="ListParagraph"/>
+        <w:rPr/>
+      </w:pPr>
+      <w:r>
+        <w:rPr>
+          <w:b/>
+        </w:rPr>
+        <w:t>Decision</w:t>
+      </w:r>
+      <w:r>
+        <w:rPr/>
+        <w:t>; wat is er besloten en waarom?</w:t>
+      </w:r>
+    </w:p>
+    <w:p>
+      <w:pPr>
+        <w:pStyle w:val="ListParagraph"/>
+        <w:rPr/>
+      </w:pPr>
+      <w:r>
+        <w:rPr>
+          <w:b/>
+        </w:rPr>
+        <w:t>Consequences</w:t>
+      </w:r>
+      <w:r>
+        <w:rPr/>
+        <w:t>; wat verandert er?</w:t>
+      </w:r>
+    </w:p>
+    <w:p>
+      <w:pPr>
+        <w:pStyle w:val="Normal"/>
+        <w:rPr/>
+      </w:pPr>
+      <w:r>
+        <w:rPr/>
+        <w:t>Zonder ADRs kan de AI in een volgende sessie een beslissing terugdraaien die je bewust hebt genomen, of een alternatief voorstellen dat je al hebt afgewezen.</w:t>
+      </w:r>
+    </w:p>
+    <w:p>
+      <w:pPr>
+        <w:pStyle w:val="Normal"/>
+        <w:rPr/>
+      </w:pPr>
+      <w:r>
+        <w:rPr>
+          <w:b/>
+        </w:rPr>
+        <w:t>Case study: Event Dispatch Gap (ADR-013)</w:t>
+      </w:r>
+    </w:p>
+    <w:p>
+      <w:pPr>
+        <w:pStyle w:val="Normal"/>
+        <w:rPr/>
+      </w:pPr>
+      <w:r>
+        <w:rPr/>
+        <w:t>Bij het implementeren van recurring tasks bleek dat het `TaskStatusChanged` event alleen werd gefired vanuit expliciete dispatch calls. Maar drie andere code paths (`AutoSaveController`, `bulkUpdate()`, `move()`) updaten status via `$task-&gt;update()` *zonder* het event te dispatchen. De oplossing: een `TaskObserver` die het event automatisch dispatcht bij elke statuswijziging.</w:t>
+      </w:r>
+    </w:p>
+    <w:p>
+      <w:pPr>
+        <w:pStyle w:val="Normal"/>
+        <w:rPr/>
+      </w:pPr>
+      <w:r>
+        <w:rPr/>
+        <w:t>Zonder ADR zou een volgende sessie niet weten dat:</w:t>
+      </w:r>
+    </w:p>
+    <w:p>
+      <w:pPr>
+        <w:pStyle w:val="ListParagraph"/>
+        <w:rPr/>
+      </w:pPr>
+      <w:r>
+        <w:rPr/>
+        <w:t>Er bewust een Observer is gekozen boven handmatige dispatch calls (en waarom)</w:t>
+      </w:r>
+    </w:p>
+    <w:p>
+      <w:pPr>
+        <w:pStyle w:val="ListParagraph"/>
+        <w:rPr/>
+      </w:pPr>
+      <w:r>
+        <w:rPr/>
+        <w:t>Handmatige dispatches bewust zijn verwijderd</w:t>
+      </w:r>
+    </w:p>
+    <w:p>
+      <w:pPr>
+        <w:pStyle w:val="ListParagraph"/>
+        <w:rPr/>
+      </w:pPr>
+      <w:r>
+        <w:rPr/>
+        <w:t>Dit ook een pre-bestaand probleem met een andere listener oploste</w:t>
+      </w:r>
+    </w:p>
+    <w:p>
+      <w:pPr>
+        <w:pStyle w:val="Normal"/>
+        <w:rPr/>
+      </w:pPr>
+      <w:r>
+        <w:rPr>
+          <w:b/>
+        </w:rPr>
+        <w:t>De ADR legt niet alleen vast *wat* er is besloten, maar ook welke alternatieven zijn afgewezen en waarom.</w:t>
+      </w:r>
+      <w:r>
+        <w:rPr/>
+        <w:t xml:space="preserve"> Dat voorkomt dat de AI (of een developer) dezelfde discussie opnieuw voert.</w:t>
+      </w:r>
+    </w:p>
+    <w:p>
+      <w:pPr>
+        <w:pStyle w:val="Normal"/>
+        <w:rPr/>
+      </w:pPr>
+      <w:r>
+        <w:rPr>
+          <w:b/>
+          <w:i/>
+        </w:rPr>
+        <w:t>Vuistregel:</w:t>
+      </w:r>
+      <w:r>
+        <w:rPr>
+          <w:i/>
+        </w:rPr>
+        <w:t xml:space="preserve"> Als iemand later zou kunnen vragen "waarom is dit zo?"; schrijf een ADR.</w:t>
       </w:r>
     </w:p>
     <w:p>
@@ -1192,7 +1380,7 @@
       </w:pPr>
       <w:r>
         <w:rPr/>
-        <w:t>Mithril in cijfers</w:t>
+        <w:t>De feedback loop</w:t>
       </w:r>
     </w:p>
     <w:tbl>
@@ -1211,14 +1399,14 @@
         <w:tblLook w:val="04a0" w:noHBand="0" w:noVBand="1" w:firstColumn="1" w:lastRow="0" w:lastColumn="0" w:firstRow="1"/>
       </w:tblPr>
       <w:tblGrid>
-        <w:gridCol w:w="4283"/>
-        <w:gridCol w:w="5073"/>
+        <w:gridCol w:w="4158"/>
+        <w:gridCol w:w="5198"/>
       </w:tblGrid>
       <w:tr>
         <w:trPr/>
         <w:tc>
           <w:tcPr>
-            <w:tcW w:w="4283" w:type="dxa"/>
+            <w:tcW w:w="4158" w:type="dxa"/>
             <w:tcBorders/>
             <w:shd w:color="auto" w:fill="958561" w:val="clear"/>
           </w:tcPr>
@@ -1247,13 +1435,13 @@
                 <w:szCs w:val="16"/>
                 <w:lang w:val="nl-NL" w:eastAsia="nl-NL" w:bidi="ar-SA"/>
               </w:rPr>
-              <w:t>Metric</w:t>
+              <w:t>Probleem</w:t>
             </w:r>
           </w:p>
         </w:tc>
         <w:tc>
           <w:tcPr>
-            <w:tcW w:w="5073" w:type="dxa"/>
+            <w:tcW w:w="5198" w:type="dxa"/>
             <w:tcBorders/>
             <w:shd w:color="auto" w:fill="958561" w:val="clear"/>
           </w:tcPr>
@@ -1282,7 +1470,7 @@
                 <w:szCs w:val="16"/>
                 <w:lang w:val="nl-NL" w:eastAsia="nl-NL" w:bidi="ar-SA"/>
               </w:rPr>
-              <w:t>Waarde</w:t>
+              <w:t>Oplossing</w:t>
             </w:r>
           </w:p>
         </w:tc>
@@ -1291,7 +1479,7 @@
         <w:trPr/>
         <w:tc>
           <w:tcPr>
-            <w:tcW w:w="4283" w:type="dxa"/>
+            <w:tcW w:w="4158" w:type="dxa"/>
             <w:tcBorders/>
             <w:tcMar>
               <w:bottom w:w="0" w:type="dxa"/>
@@ -1320,13 +1508,13 @@
                 <w:szCs w:val="20"/>
                 <w:lang w:val="nl-NL" w:eastAsia="nl-NL" w:bidi="ar-SA"/>
               </w:rPr>
-              <w:t>Testbestanden</w:t>
+              <w:t>AI vergeet vorige sessie</w:t>
             </w:r>
           </w:p>
         </w:tc>
         <w:tc>
           <w:tcPr>
-            <w:tcW w:w="5073" w:type="dxa"/>
+            <w:tcW w:w="5198" w:type="dxa"/>
             <w:tcBorders/>
             <w:tcMar>
               <w:bottom w:w="0" w:type="dxa"/>
@@ -1355,7 +1543,7 @@
                 <w:szCs w:val="20"/>
                 <w:lang w:val="nl-NL" w:eastAsia="nl-NL" w:bidi="ar-SA"/>
               </w:rPr>
-              <w:t>161</w:t>
+              <w:t>ADRs + plan overleven sessies</w:t>
             </w:r>
           </w:p>
         </w:tc>
@@ -1364,7 +1552,7 @@
         <w:trPr/>
         <w:tc>
           <w:tcPr>
-            <w:tcW w:w="4283" w:type="dxa"/>
+            <w:tcW w:w="4158" w:type="dxa"/>
             <w:tcBorders/>
             <w:tcMar>
               <w:bottom w:w="0" w:type="dxa"/>
@@ -1393,13 +1581,13 @@
                 <w:szCs w:val="20"/>
                 <w:lang w:val="nl-NL" w:eastAsia="nl-NL" w:bidi="ar-SA"/>
               </w:rPr>
-              <w:t>Testfuncties</w:t>
+              <w:t>AI breekt bestaande code</w:t>
             </w:r>
           </w:p>
         </w:tc>
         <w:tc>
           <w:tcPr>
-            <w:tcW w:w="5073" w:type="dxa"/>
+            <w:tcW w:w="5198" w:type="dxa"/>
             <w:tcBorders/>
             <w:tcMar>
               <w:bottom w:w="0" w:type="dxa"/>
@@ -1428,7 +1616,7 @@
                 <w:szCs w:val="20"/>
                 <w:lang w:val="nl-NL" w:eastAsia="nl-NL" w:bidi="ar-SA"/>
               </w:rPr>
-              <w:t>995</w:t>
+              <w:t>Tests vangen regressies direct</w:t>
             </w:r>
           </w:p>
         </w:tc>
@@ -1437,7 +1625,7 @@
         <w:trPr/>
         <w:tc>
           <w:tcPr>
-            <w:tcW w:w="4283" w:type="dxa"/>
+            <w:tcW w:w="4158" w:type="dxa"/>
             <w:tcBorders/>
             <w:tcMar>
               <w:bottom w:w="0" w:type="dxa"/>
@@ -1466,13 +1654,13 @@
                 <w:szCs w:val="20"/>
                 <w:lang w:val="nl-NL" w:eastAsia="nl-NL" w:bidi="ar-SA"/>
               </w:rPr>
-              <w:t>Commits</w:t>
+              <w:t>AI gebruikt andere patronen</w:t>
             </w:r>
           </w:p>
         </w:tc>
         <w:tc>
           <w:tcPr>
-            <w:tcW w:w="5073" w:type="dxa"/>
+            <w:tcW w:w="5198" w:type="dxa"/>
             <w:tcBorders/>
             <w:tcMar>
               <w:bottom w:w="0" w:type="dxa"/>
@@ -1501,7 +1689,7 @@
                 <w:szCs w:val="20"/>
                 <w:lang w:val="nl-NL" w:eastAsia="nl-NL" w:bidi="ar-SA"/>
               </w:rPr>
-              <w:t>318</w:t>
+              <w:t>Plan + codebase scan dwingen patronen af</w:t>
             </w:r>
           </w:p>
         </w:tc>
@@ -1510,7 +1698,7 @@
         <w:trPr/>
         <w:tc>
           <w:tcPr>
-            <w:tcW w:w="4283" w:type="dxa"/>
+            <w:tcW w:w="4158" w:type="dxa"/>
             <w:tcBorders/>
             <w:tcMar>
               <w:bottom w:w="0" w:type="dxa"/>
@@ -1539,13 +1727,13 @@
                 <w:szCs w:val="20"/>
                 <w:lang w:val="nl-NL" w:eastAsia="nl-NL" w:bidi="ar-SA"/>
               </w:rPr>
-              <w:t>Ratio tests/commits</w:t>
+              <w:t>AI voegt ongeplande features toe</w:t>
             </w:r>
           </w:p>
         </w:tc>
         <w:tc>
           <w:tcPr>
-            <w:tcW w:w="5073" w:type="dxa"/>
+            <w:tcW w:w="5198" w:type="dxa"/>
             <w:tcBorders/>
             <w:tcMar>
               <w:bottom w:w="0" w:type="dxa"/>
@@ -1574,7 +1762,80 @@
                 <w:szCs w:val="20"/>
                 <w:lang w:val="nl-NL" w:eastAsia="nl-NL" w:bidi="ar-SA"/>
               </w:rPr>
-              <w:t>~3:1</w:t>
+              <w:t>Plan met "Out of Scope" sectie</w:t>
+            </w:r>
+          </w:p>
+        </w:tc>
+      </w:tr>
+      <w:tr>
+        <w:trPr/>
+        <w:tc>
+          <w:tcPr>
+            <w:tcW w:w="4158" w:type="dxa"/>
+            <w:tcBorders/>
+            <w:tcMar>
+              <w:bottom w:w="0" w:type="dxa"/>
+            </w:tcMar>
+          </w:tcPr>
+          <w:p>
+            <w:pPr>
+              <w:pStyle w:val="Normal"/>
+              <w:widowControl/>
+              <w:spacing w:before="0" w:after="240"/>
+              <w:contextualSpacing/>
+              <w:jc w:val="start"/>
+              <w:rPr>
+                <w:rFonts w:eastAsia="Times New Roman" w:cs="Times New Roman"/>
+                <w:kern w:val="0"/>
+                <w:sz w:val="18"/>
+                <w:szCs w:val="20"/>
+                <w:lang w:val="nl-NL" w:eastAsia="nl-NL" w:bidi="ar-SA"/>
+              </w:rPr>
+            </w:pPr>
+            <w:r>
+              <w:rPr>
+                <w:rFonts w:eastAsia="Times New Roman" w:cs="Times New Roman"/>
+                <w:kern w:val="0"/>
+                <w:sz w:val="18"/>
+                <w:szCs w:val="20"/>
+                <w:lang w:val="nl-NL" w:eastAsia="nl-NL" w:bidi="ar-SA"/>
+              </w:rPr>
+              <w:t>AI draait bewuste keuzes terug</w:t>
+            </w:r>
+          </w:p>
+        </w:tc>
+        <w:tc>
+          <w:tcPr>
+            <w:tcW w:w="5198" w:type="dxa"/>
+            <w:tcBorders/>
+            <w:tcMar>
+              <w:bottom w:w="0" w:type="dxa"/>
+            </w:tcMar>
+          </w:tcPr>
+          <w:p>
+            <w:pPr>
+              <w:pStyle w:val="Normal"/>
+              <w:widowControl/>
+              <w:spacing w:before="0" w:after="240"/>
+              <w:contextualSpacing/>
+              <w:jc w:val="start"/>
+              <w:rPr>
+                <w:rFonts w:eastAsia="Times New Roman" w:cs="Times New Roman"/>
+                <w:kern w:val="0"/>
+                <w:sz w:val="18"/>
+                <w:szCs w:val="20"/>
+                <w:lang w:val="nl-NL" w:eastAsia="nl-NL" w:bidi="ar-SA"/>
+              </w:rPr>
+            </w:pPr>
+            <w:r>
+              <w:rPr>
+                <w:rFonts w:eastAsia="Times New Roman" w:cs="Times New Roman"/>
+                <w:kern w:val="0"/>
+                <w:sz w:val="18"/>
+                <w:szCs w:val="20"/>
+                <w:lang w:val="nl-NL" w:eastAsia="nl-NL" w:bidi="ar-SA"/>
+              </w:rPr>
+              <w:t>ADRs documenteren het *waarom*</w:t>
             </w:r>
           </w:p>
         </w:tc>
@@ -1591,16 +1852,6 @@
     </w:p>
     <w:p>
       <w:pPr>
-        <w:pStyle w:val="Normal"/>
-        <w:rPr/>
-      </w:pPr>
-      <w:r>
-        <w:rPr/>
-        <w:t>Elke nieuwe feature begon met tests. Elke bug fix begon met een test die de bug reproduceerde.</w:t>
-      </w:r>
-    </w:p>
-    <w:p>
-      <w:pPr>
         <w:pStyle w:val="Heading2"/>
         <w:rPr/>
       </w:pPr>
@@ -1618,7 +1869,7 @@
       </w:pPr>
       <w:r>
         <w:rPr/>
-        <w:t>Deel 3: Architecture Decision Records</w:t>
+        <w:t>Deel 3: Toepassen en Valkuilen</w:t>
       </w:r>
     </w:p>
     <w:p>
@@ -1628,17 +1879,7 @@
       </w:pPr>
       <w:r>
         <w:rPr/>
-        <w:t>Wat is een ADR?</w:t>
-      </w:r>
-    </w:p>
-    <w:p>
-      <w:pPr>
-        <w:pStyle w:val="Normal"/>
-        <w:rPr/>
-      </w:pPr>
-      <w:r>
-        <w:rPr/>
-        <w:t>Een ADR documenteert:</w:t>
+        <w:t>De vijf belangrijkste lessen</w:t>
       </w:r>
     </w:p>
     <w:p>
@@ -1650,11 +1891,11 @@
         <w:rPr>
           <w:b/>
         </w:rPr>
-        <w:t>Context</w:t>
-      </w:r>
-      <w:r>
-        <w:rPr/>
-        <w:t xml:space="preserve"> — Wat was het probleem? Welke alternatieven zijn overwogen?</w:t>
+        <w:t>Als het niet in een bestand staat, bestaat het niet.</w:t>
+      </w:r>
+      <w:r>
+        <w:rPr/>
+        <w:t xml:space="preserve"> Elke AI-sessie begint leeg. Context die alleen in je hoofd zit, gaat verloren.</w:t>
       </w:r>
     </w:p>
     <w:p>
@@ -1666,11 +1907,11 @@
         <w:rPr>
           <w:b/>
         </w:rPr>
-        <w:t>Decision</w:t>
-      </w:r>
-      <w:r>
-        <w:rPr/>
-        <w:t xml:space="preserve"> — Wat is er besloten en waarom?</w:t>
+        <w:t>Maak specs testbaar.</w:t>
+      </w:r>
+      <w:r>
+        <w:rPr/>
+        <w:t xml:space="preserve"> Als je het niet in een test kunt uitdrukken, is de spec te vaag. Dit is waar plan en TDD samenkomen.</w:t>
       </w:r>
     </w:p>
     <w:p>
@@ -1682,231 +1923,111 @@
         <w:rPr>
           <w:b/>
         </w:rPr>
-        <w:t>Consequences</w:t>
-      </w:r>
-      <w:r>
-        <w:rPr/>
-        <w:t xml:space="preserve"> — Wat verandert er? Welke impact heeft dit?</w:t>
-      </w:r>
-    </w:p>
-    <w:p>
-      <w:pPr>
-        <w:pStyle w:val="Heading3"/>
-        <w:rPr/>
-      </w:pPr>
-      <w:r>
-        <w:rPr/>
-        <w:t>Waarom ADRs cruciaal zijn bij AI-assisted development</w:t>
-      </w:r>
-    </w:p>
-    <w:p>
-      <w:pPr>
-        <w:pStyle w:val="Normal"/>
-        <w:rPr/>
-      </w:pPr>
-      <w:r>
-        <w:rPr/>
-        <w:t>Zonder ADRs kan een AI:</w:t>
+        <w:t>Schrijf ADRs op het moment van de beslissing.</w:t>
+      </w:r>
+      <w:r>
+        <w:rPr/>
+        <w:t xml:space="preserve"> Achteraf mis je de alternatieven die je hebt overwogen.</w:t>
       </w:r>
     </w:p>
     <w:p>
       <w:pPr>
         <w:pStyle w:val="ListParagraph"/>
-        <w:rPr/>
-      </w:pPr>
-      <w:r>
-        <w:rPr/>
-        <w:t>Een beslissing terugdraaien die je bewust hebt genomen</w:t>
-      </w:r>
-    </w:p>
-    <w:p>
-      <w:pPr>
-        <w:pStyle w:val="ListParagraph"/>
-        <w:rPr/>
-      </w:pPr>
-      <w:r>
-        <w:rPr/>
-        <w:t>Een alternatief voorstellen dat je al hebt afgewezen (met goede redenen)</w:t>
-      </w:r>
-    </w:p>
-    <w:p>
-      <w:pPr>
-        <w:pStyle w:val="ListParagraph"/>
-        <w:rPr/>
-      </w:pPr>
-      <w:r>
-        <w:rPr/>
-        <w:t>Dezelfde trade-off discussie opnieuw voeren in elke sessie</w:t>
-      </w:r>
-    </w:p>
-    <w:p>
-      <w:pPr>
-        <w:pStyle w:val="Normal"/>
-        <w:rPr/>
-      </w:pPr>
-      <w:r>
-        <w:rPr/>
-        <w:t>Met ADRs:</w:t>
-      </w:r>
-    </w:p>
-    <w:p>
-      <w:pPr>
-        <w:pStyle w:val="ListParagraph"/>
-        <w:rPr/>
-      </w:pPr>
-      <w:r>
-        <w:rPr/>
-        <w:t>De AI leest de bestaande ADRs aan het begin van elke sessie</w:t>
-      </w:r>
-    </w:p>
-    <w:p>
-      <w:pPr>
-        <w:pStyle w:val="ListParagraph"/>
-        <w:rPr/>
-      </w:pPr>
-      <w:r>
-        <w:rPr/>
-        <w:t>Eerdere beslissingen worden gerespecteerd</w:t>
-      </w:r>
-    </w:p>
-    <w:p>
-      <w:pPr>
-        <w:pStyle w:val="ListParagraph"/>
-        <w:rPr/>
-      </w:pPr>
-      <w:r>
-        <w:rPr/>
-        <w:t>Nieuwe beslissingen worden automatisch gedocumenteerd</w:t>
-      </w:r>
-    </w:p>
-    <w:p>
-      <w:pPr>
-        <w:pStyle w:val="Heading3"/>
-        <w:rPr/>
-      </w:pPr>
-      <w:r>
-        <w:rPr/>
-        <w:t>Case study: Recurring Tasks en het Event Dispatch Gap (ADR-013)</w:t>
-      </w:r>
-    </w:p>
-    <w:p>
-      <w:pPr>
-        <w:pStyle w:val="Normal"/>
         <w:rPr/>
       </w:pPr>
       <w:r>
         <w:rPr>
           <w:b/>
         </w:rPr>
-        <w:t>Situatie:</w:t>
-      </w:r>
-      <w:r>
-        <w:rPr/>
-        <w:t xml:space="preserve"> Bij het implementeren van recurring tasks ontdekte de TDD-cyclus dat `TaskStatusChanged` events alleen werden gefired vanuit expliciete dispatch calls. Maar `AutoSaveController`, `bulkUpdate()` en `move()` updaten status via `$task-&gt;update()` *zonder* het event te dispatchen.</w:t>
-      </w:r>
-    </w:p>
-    <w:p>
-      <w:pPr>
-        <w:pStyle w:val="Normal"/>
+        <w:t>Houd sessies klein.</w:t>
+      </w:r>
+      <w:r>
+        <w:rPr/>
+        <w:t xml:space="preserve"> Context windows hebben limieten. Kleine fases in het plan houden sessies beheersbaar en voorkomen context compressie.</w:t>
+      </w:r>
+    </w:p>
+    <w:p>
+      <w:pPr>
+        <w:pStyle w:val="ListParagraph"/>
         <w:rPr/>
       </w:pPr>
       <w:r>
         <w:rPr>
           <w:b/>
         </w:rPr>
-        <w:t>Consequentie zonder ADR:</w:t>
-      </w:r>
-      <w:r>
-        <w:rPr/>
-        <w:t xml:space="preserve"> In een volgende sessie zou de AI niet weten dat:</w:t>
+        <w:t>Jij blijft de architect.</w:t>
+      </w:r>
+      <w:r>
+        <w:rPr/>
+        <w:t xml:space="preserve"> De AI is een krachtig hulpmiddel, maar review, denk mee, en stel vragen. Blind vertrouwen leidt tot blinde vlekken.</w:t>
+      </w:r>
+    </w:p>
+    <w:p>
+      <w:pPr>
+        <w:pStyle w:val="Heading3"/>
+        <w:rPr/>
+      </w:pPr>
+      <w:r>
+        <w:rPr/>
+        <w:t>Hoe begin je?</w:t>
+      </w:r>
+    </w:p>
+    <w:p>
+      <w:pPr>
+        <w:pStyle w:val="Normal"/>
+        <w:rPr/>
+      </w:pPr>
+      <w:r>
+        <w:rPr/>
+        <w:t>Je hebt geen speciale tooling nodig om dit toe te passen:</w:t>
       </w:r>
     </w:p>
     <w:p>
       <w:pPr>
         <w:pStyle w:val="ListParagraph"/>
-        <w:rPr/>
-      </w:pPr>
-      <w:r>
-        <w:rPr/>
-        <w:t>Er een `TaskObserver` is toegevoegd als oplossing</w:t>
-      </w:r>
-    </w:p>
-    <w:p>
-      <w:pPr>
-        <w:pStyle w:val="ListParagraph"/>
-        <w:rPr/>
-      </w:pPr>
-      <w:r>
-        <w:rPr/>
-        <w:t>Handmatige event dispatches bewust zijn verwijderd</w:t>
-      </w:r>
-    </w:p>
-    <w:p>
-      <w:pPr>
-        <w:pStyle w:val="ListParagraph"/>
-        <w:rPr/>
-      </w:pPr>
-      <w:r>
-        <w:rPr/>
-        <w:t>Dit systeem ook het pre-bestaande probleem met `CreateFollowUpOnWaiting` oploste</w:t>
-      </w:r>
-    </w:p>
-    <w:p>
-      <w:pPr>
-        <w:pStyle w:val="Normal"/>
         <w:rPr/>
       </w:pPr>
       <w:r>
         <w:rPr>
           <w:b/>
         </w:rPr>
-        <w:t>Met ADR-013:</w:t>
-      </w:r>
-      <w:r>
-        <w:rPr/>
-        <w:t xml:space="preserve"> Elke toekomstige sessie leest dit record en begrijpt het complete plaatje — de trigger, de alternatieven, en de gekozen oplossing.</w:t>
-      </w:r>
-    </w:p>
-    <w:p>
-      <w:pPr>
-        <w:pStyle w:val="Heading3"/>
-        <w:rPr/>
-      </w:pPr>
-      <w:r>
-        <w:rPr/>
-        <w:t>Case study: FK Removal als bewuste keuze (ADR-019)</w:t>
-      </w:r>
-    </w:p>
-    <w:p>
-      <w:pPr>
-        <w:pStyle w:val="Normal"/>
+        <w:t>Start elke AI-sessie met context laden</w:t>
+      </w:r>
+      <w:r>
+        <w:rPr/>
+        <w:t>; geef de AI bij de start de relevante ADRs, het plan, en laat hem de tests lezen.</w:t>
+      </w:r>
+    </w:p>
+    <w:p>
+      <w:pPr>
+        <w:pStyle w:val="ListParagraph"/>
         <w:rPr/>
       </w:pPr>
       <w:r>
         <w:rPr>
           <w:b/>
         </w:rPr>
-        <w:t>Situatie:</w:t>
-      </w:r>
-      <w:r>
-        <w:rPr/>
-        <w:t xml:space="preserve"> `attachments.activity_id` had een FK constraint met `cascadeOnDelete`. Maar het plan specificeerde ook een cleanup command voor orphaned attachments — die structureel onmogelijk zouden zijn met een FK cascade.</w:t>
-      </w:r>
-    </w:p>
-    <w:p>
-      <w:pPr>
-        <w:pStyle w:val="Normal"/>
+        <w:t>Gebruik een `CLAUDE.md` (of equivalent)</w:t>
+      </w:r>
+      <w:r>
+        <w:rPr/>
+        <w:t>; een bestand in je repo dat de AI automatisch leest bij elke sessie. Hierin staan conventies, actieve plannen, en verwijzingen naar ADRs.</w:t>
+      </w:r>
+    </w:p>
+    <w:p>
+      <w:pPr>
+        <w:pStyle w:val="ListParagraph"/>
         <w:rPr/>
       </w:pPr>
       <w:r>
         <w:rPr>
           <w:b/>
         </w:rPr>
-        <w:t>Drie alternatieven overwogen</w:t>
-      </w:r>
-      <w:r>
-        <w:rPr/>
-        <w:t xml:space="preserve"> (gedocumenteerd in de ADR):</w:t>
+        <w:t>Houd ADRs klein</w:t>
+      </w:r>
+      <w:r>
+        <w:rPr/>
+        <w:t>; een ADR per beslissing, niet een mega-document per feature.</w:t>
       </w:r>
     </w:p>
     <w:p>
@@ -1914,45 +2035,15 @@
         <w:pStyle w:val="ListParagraph"/>
         <w:rPr/>
       </w:pPr>
-      <w:r>
-        <w:rPr/>
-        <w:t>FK houden, cleanup command verwijderen</w:t>
-      </w:r>
-    </w:p>
-    <w:p>
-      <w:pPr>
-        <w:pStyle w:val="ListParagraph"/>
-        <w:rPr/>
-      </w:pPr>
-      <w:r>
-        <w:rPr/>
-        <w:t>FK houden, cleanup command anders testen</w:t>
-      </w:r>
-    </w:p>
-    <w:p>
-      <w:pPr>
-        <w:pStyle w:val="ListParagraph"/>
-        <w:rPr/>
-      </w:pPr>
-      <w:r>
-        <w:rPr/>
-        <w:t>FK verwijderen, cleanup command behouden</w:t>
-      </w:r>
-    </w:p>
-    <w:p>
-      <w:pPr>
-        <w:pStyle w:val="Normal"/>
-        <w:rPr/>
-      </w:pPr>
-      <w:r>
-        <w:rPr/>
-        <w:t xml:space="preserve">Zonder ADR zou een toekomstige AI (of developer) de missende FK als een bug beschouwen en hem "fixen". </w:t>
-      </w:r>
       <w:r>
         <w:rPr>
           <w:b/>
         </w:rPr>
-        <w:t>De ADR voorkomt dat een bewuste beslissing wordt teruggedraaid.</w:t>
+        <w:t>Gebruik het plan als communicatiemiddel</w:t>
+      </w:r>
+      <w:r>
+        <w:rPr/>
+        <w:t>; niet alleen voor de AI, maar ook voor je team.</w:t>
       </w:r>
     </w:p>
     <w:p>
@@ -1962,394 +2053,7 @@
       </w:pPr>
       <w:r>
         <w:rPr/>
-        <w:t>Het ADR-systeem in de praktijk</w:t>
-      </w:r>
-    </w:p>
-    <w:p>
-      <w:pPr>
-        <w:pStyle w:val="Normal"/>
-        <w:rPr/>
-      </w:pPr>
-      <w:r>
-        <w:rPr/>
-        <w:t>Het systeem bestaat uit drie skills:</w:t>
-      </w:r>
-    </w:p>
-    <w:p>
-      <w:pPr>
-        <w:pStyle w:val="Normal"/>
-        <w:rPr/>
-      </w:pPr>
-      <w:r>
-        <w:rPr>
-          <w:b/>
-        </w:rPr>
-        <w:t>`/bdk-adr`</w:t>
-      </w:r>
-      <w:r>
-        <w:rPr/>
-        <w:t xml:space="preserve"> — Activatie aan het begin van elke sessie:</w:t>
-      </w:r>
-    </w:p>
-    <w:p>
-      <w:pPr>
-        <w:pStyle w:val="ListParagraph"/>
-        <w:rPr/>
-      </w:pPr>
-      <w:r>
-        <w:rPr/>
-        <w:t>Leest het architectuurplan</w:t>
-      </w:r>
-    </w:p>
-    <w:p>
-      <w:pPr>
-        <w:pStyle w:val="ListParagraph"/>
-        <w:rPr/>
-      </w:pPr>
-      <w:r>
-        <w:rPr/>
-        <w:t>Leest de ADR-index en relevante bestaande ADRs</w:t>
-      </w:r>
-    </w:p>
-    <w:p>
-      <w:pPr>
-        <w:pStyle w:val="ListParagraph"/>
-        <w:rPr/>
-      </w:pPr>
-      <w:r>
-        <w:rPr/>
-        <w:t>Bevestigt de scope van het werk met bekende constraints</w:t>
-      </w:r>
-    </w:p>
-    <w:p>
-      <w:pPr>
-        <w:pStyle w:val="Normal"/>
-        <w:rPr/>
-      </w:pPr>
-      <w:r>
-        <w:rPr>
-          <w:b/>
-        </w:rPr>
-        <w:t>`/bdk-adr-entry`</w:t>
-      </w:r>
-      <w:r>
-        <w:rPr/>
-        <w:t xml:space="preserve"> — Automatisch getriggerd wanneer:</w:t>
-      </w:r>
-    </w:p>
-    <w:p>
-      <w:pPr>
-        <w:pStyle w:val="ListParagraph"/>
-        <w:rPr/>
-      </w:pPr>
-      <w:r>
-        <w:rPr/>
-        <w:t>De implementatie afwijkt van het plan</w:t>
-      </w:r>
-    </w:p>
-    <w:p>
-      <w:pPr>
-        <w:pStyle w:val="ListParagraph"/>
-        <w:rPr/>
-      </w:pPr>
-      <w:r>
-        <w:rPr/>
-        <w:t>Een API contract of datamodel verandert</w:t>
-      </w:r>
-    </w:p>
-    <w:p>
-      <w:pPr>
-        <w:pStyle w:val="ListParagraph"/>
-        <w:rPr/>
-      </w:pPr>
-      <w:r>
-        <w:rPr/>
-        <w:t>Een technologie wordt toegevoegd of vervangen</w:t>
-      </w:r>
-    </w:p>
-    <w:p>
-      <w:pPr>
-        <w:pStyle w:val="ListParagraph"/>
-        <w:rPr/>
-      </w:pPr>
-      <w:r>
-        <w:rPr/>
-        <w:t>Een niet-triviale trade-off wordt gemaakt</w:t>
-      </w:r>
-    </w:p>
-    <w:p>
-      <w:pPr>
-        <w:pStyle w:val="Normal"/>
-        <w:rPr/>
-      </w:pPr>
-      <w:r>
-        <w:rPr>
-          <w:b/>
-          <w:i/>
-        </w:rPr>
-        <w:t>Vuistregel:</w:t>
-      </w:r>
-      <w:r>
-        <w:rPr>
-          <w:i/>
-        </w:rPr>
-        <w:t xml:space="preserve"> Als iemand later zou kunnen vragen "waarom is dit zo?", schrijf een ADR.</w:t>
-      </w:r>
-    </w:p>
-    <w:p>
-      <w:pPr>
-        <w:pStyle w:val="Heading3"/>
-        <w:rPr/>
-      </w:pPr>
-      <w:r>
-        <w:rPr/>
-        <w:t>Mithril ADRs: 23 records in 3 weken</w:t>
-      </w:r>
-    </w:p>
-    <w:p>
-      <w:pPr>
-        <w:pStyle w:val="Normal"/>
-        <w:rPr/>
-      </w:pPr>
-      <w:r>
-        <w:rPr/>
-        <w:t>Van simpele trait redesigns (ADR-001) tot complexe integratiebeslissingen (ADR-008: Office 365 Calendar Integration). Elke ADR volgt hetzelfde template:</w:t>
-      </w:r>
-    </w:p>
-    <w:p>
-      <w:pPr>
-        <w:pStyle w:val="Heading2"/>
-        <w:rPr/>
-      </w:pPr>
-      <w:r>
-        <w:rPr/>
-      </w:r>
-      <w:r>
-        <w:br w:type="page"/>
-      </w:r>
-    </w:p>
-    <w:p>
-      <w:pPr>
-        <w:pStyle w:val="Heading2"/>
-        <w:rPr/>
-      </w:pPr>
-      <w:r>
-        <w:rPr/>
-        <w:t>Deel 4: Het Plan-systeem — De lijm ertussen</w:t>
-      </w:r>
-    </w:p>
-    <w:p>
-      <w:pPr>
-        <w:pStyle w:val="Heading3"/>
-        <w:rPr/>
-      </w:pPr>
-      <w:r>
-        <w:rPr/>
-        <w:t>Waarom een plan?</w:t>
-      </w:r>
-    </w:p>
-    <w:p>
-      <w:pPr>
-        <w:pStyle w:val="Normal"/>
-        <w:rPr/>
-      </w:pPr>
-      <w:r>
-        <w:rPr/>
-        <w:t xml:space="preserve">Tests beschrijven *wat* het systeem doet. ADRs beschrijven *waarom* keuzes zijn gemaakt. Maar geen van beide beschrijft </w:t>
-      </w:r>
-      <w:r>
-        <w:rPr>
-          <w:b/>
-        </w:rPr>
-        <w:t>wat je aan het bouwen bent en hoe ver je bent</w:t>
-      </w:r>
-      <w:r>
-        <w:rPr/>
-        <w:t>.</w:t>
-      </w:r>
-    </w:p>
-    <w:p>
-      <w:pPr>
-        <w:pStyle w:val="Normal"/>
-        <w:rPr/>
-      </w:pPr>
-      <w:r>
-        <w:rPr/>
-        <w:t>Het plan is het overkoepelende document dat:</w:t>
-      </w:r>
-    </w:p>
-    <w:p>
-      <w:pPr>
-        <w:pStyle w:val="ListParagraph"/>
-        <w:rPr/>
-      </w:pPr>
-      <w:r>
-        <w:rPr/>
-        <w:t>De scope definieert (en expliciet vastlegt wat *out of scope* is)</w:t>
-      </w:r>
-    </w:p>
-    <w:p>
-      <w:pPr>
-        <w:pStyle w:val="ListParagraph"/>
-        <w:rPr/>
-      </w:pPr>
-      <w:r>
-        <w:rPr/>
-        <w:t>Het werk opdeelt in fases die in een sessie passen</w:t>
-      </w:r>
-    </w:p>
-    <w:p>
-      <w:pPr>
-        <w:pStyle w:val="ListParagraph"/>
-        <w:rPr/>
-      </w:pPr>
-      <w:r>
-        <w:rPr/>
-        <w:t>Elke spec testbaar maakt (directe input voor TDD)</w:t>
-      </w:r>
-    </w:p>
-    <w:p>
-      <w:pPr>
-        <w:pStyle w:val="ListParagraph"/>
-        <w:rPr/>
-      </w:pPr>
-      <w:r>
-        <w:rPr/>
-        <w:t>Voortgang bijhoudt (checkboxes per spec item)</w:t>
-      </w:r>
-    </w:p>
-    <w:p>
-      <w:pPr>
-        <w:pStyle w:val="Heading3"/>
-        <w:rPr/>
-      </w:pPr>
-      <w:r>
-        <w:rPr/>
-        <w:t>`/bdk-plan-create` — Van idee naar gestructureerd plan</w:t>
-      </w:r>
-    </w:p>
-    <w:p>
-      <w:pPr>
-        <w:pStyle w:val="Normal"/>
-        <w:rPr/>
-      </w:pPr>
-      <w:r>
-        <w:rPr/>
-        <w:t>Het proces:</w:t>
-      </w:r>
-    </w:p>
-    <w:p>
-      <w:pPr>
-        <w:pStyle w:val="Normal"/>
-        <w:rPr/>
-      </w:pPr>
-      <w:r>
-        <w:rPr>
-          <w:b/>
-        </w:rPr>
-        <w:t>Cruciale regel:</w:t>
-      </w:r>
-      <w:r>
-        <w:rPr/>
-        <w:t xml:space="preserve"> *"Specs must be testable. Every spec item should be verifiable with a test."*</w:t>
-      </w:r>
-    </w:p>
-    <w:p>
-      <w:pPr>
-        <w:pStyle w:val="Normal"/>
-        <w:rPr/>
-      </w:pPr>
-      <w:r>
-        <w:rPr/>
-        <w:t>Dit is waar plan en TDD samenkomen — elke bullet in het plan wordt een test in de red-green-refactor cyclus.</w:t>
-      </w:r>
-    </w:p>
-    <w:p>
-      <w:pPr>
-        <w:pStyle w:val="Heading3"/>
-        <w:rPr/>
-      </w:pPr>
-      <w:r>
-        <w:rPr/>
-        <w:t>`/bdk-plan-execute` — Gestructureerde uitvoering</w:t>
-      </w:r>
-    </w:p>
-    <w:p>
-      <w:pPr>
-        <w:pStyle w:val="Normal"/>
-        <w:rPr/>
-      </w:pPr>
-      <w:r>
-        <w:rPr/>
-        <w:t>Het uitvoeringsproces integreert alle drie de systemen:</w:t>
-      </w:r>
-    </w:p>
-    <w:p>
-      <w:pPr>
-        <w:pStyle w:val="Heading3"/>
-        <w:rPr/>
-      </w:pPr>
-      <w:r>
-        <w:rPr/>
-        <w:t>Voorbeeld: Recurring Tasks plan</w:t>
-      </w:r>
-    </w:p>
-    <w:p>
-      <w:pPr>
-        <w:pStyle w:val="Normal"/>
-        <w:rPr/>
-      </w:pPr>
-      <w:r>
-        <w:rPr>
-          <w:b/>
-        </w:rPr>
-        <w:t>Let op Phase 0</w:t>
-      </w:r>
-      <w:r>
-        <w:rPr/>
-        <w:t xml:space="preserve"> — die stond niet in het oorspronkelijke plan. Tijdens TDD werd het event dispatch gap ontdekt, het plan werd bijgewerkt, en een ADR geschreven (ADR-013). Het plan is een levend document.</w:t>
-      </w:r>
-    </w:p>
-    <w:p>
-      <w:pPr>
-        <w:pStyle w:val="Heading2"/>
-        <w:rPr/>
-      </w:pPr>
-      <w:r>
-        <w:rPr/>
-      </w:r>
-      <w:r>
-        <w:br w:type="page"/>
-      </w:r>
-    </w:p>
-    <w:p>
-      <w:pPr>
-        <w:pStyle w:val="Heading2"/>
-        <w:rPr/>
-      </w:pPr>
-      <w:r>
-        <w:rPr/>
-        <w:t>Deel 5: Hoe de drie systemen samenwerken</w:t>
-      </w:r>
-    </w:p>
-    <w:p>
-      <w:pPr>
-        <w:pStyle w:val="Heading3"/>
-        <w:rPr/>
-      </w:pPr>
-      <w:r>
-        <w:rPr/>
-        <w:t>De feedback loop</w:t>
-      </w:r>
-    </w:p>
-    <w:p>
-      <w:pPr>
-        <w:pStyle w:val="Heading3"/>
-        <w:rPr/>
-      </w:pPr>
-      <w:r>
-        <w:rPr/>
-        <w:t>Wat dit oplost</w:t>
+        <w:t>Mithril in cijfers</w:t>
       </w:r>
     </w:p>
     <w:tbl>
@@ -2368,14 +2072,14 @@
         <w:tblLook w:val="04a0" w:noHBand="0" w:noVBand="1" w:firstColumn="1" w:lastRow="0" w:lastColumn="0" w:firstRow="1"/>
       </w:tblPr>
       <w:tblGrid>
-        <w:gridCol w:w="5433"/>
-        <w:gridCol w:w="3923"/>
+        <w:gridCol w:w="4402"/>
+        <w:gridCol w:w="4954"/>
       </w:tblGrid>
       <w:tr>
         <w:trPr/>
         <w:tc>
           <w:tcPr>
-            <w:tcW w:w="5433" w:type="dxa"/>
+            <w:tcW w:w="4402" w:type="dxa"/>
             <w:tcBorders/>
             <w:shd w:color="auto" w:fill="958561" w:val="clear"/>
           </w:tcPr>
@@ -2404,13 +2108,13 @@
                 <w:szCs w:val="16"/>
                 <w:lang w:val="nl-NL" w:eastAsia="nl-NL" w:bidi="ar-SA"/>
               </w:rPr>
-              <w:t>Probleem</w:t>
+              <w:t>Metric</w:t>
             </w:r>
           </w:p>
         </w:tc>
         <w:tc>
           <w:tcPr>
-            <w:tcW w:w="3923" w:type="dxa"/>
+            <w:tcW w:w="4954" w:type="dxa"/>
             <w:tcBorders/>
             <w:shd w:color="auto" w:fill="958561" w:val="clear"/>
           </w:tcPr>
@@ -2439,7 +2143,7 @@
                 <w:szCs w:val="16"/>
                 <w:lang w:val="nl-NL" w:eastAsia="nl-NL" w:bidi="ar-SA"/>
               </w:rPr>
-              <w:t>Oplossing</w:t>
+              <w:t>Waarde</w:t>
             </w:r>
           </w:p>
         </w:tc>
@@ -2448,7 +2152,7 @@
         <w:trPr/>
         <w:tc>
           <w:tcPr>
-            <w:tcW w:w="5433" w:type="dxa"/>
+            <w:tcW w:w="4402" w:type="dxa"/>
             <w:tcBorders/>
             <w:tcMar>
               <w:bottom w:w="0" w:type="dxa"/>
@@ -2472,29 +2176,18 @@
             <w:r>
               <w:rPr>
                 <w:rFonts w:eastAsia="Times New Roman" w:cs="Times New Roman"/>
-                <w:b/>
-                <w:kern w:val="0"/>
-                <w:sz w:val="18"/>
-                <w:szCs w:val="20"/>
-                <w:lang w:val="nl-NL" w:eastAsia="nl-NL" w:bidi="ar-SA"/>
-              </w:rPr>
-              <w:t>Context rot</w:t>
-            </w:r>
-            <w:r>
-              <w:rPr>
-                <w:rFonts w:eastAsia="Times New Roman" w:cs="Times New Roman"/>
-                <w:kern w:val="0"/>
-                <w:sz w:val="18"/>
-                <w:szCs w:val="20"/>
-                <w:lang w:val="nl-NL" w:eastAsia="nl-NL" w:bidi="ar-SA"/>
-              </w:rPr>
-              <w:t xml:space="preserve"> (AI vergeet vorige sessie)</w:t>
+                <w:kern w:val="0"/>
+                <w:sz w:val="18"/>
+                <w:szCs w:val="20"/>
+                <w:lang w:val="nl-NL" w:eastAsia="nl-NL" w:bidi="ar-SA"/>
+              </w:rPr>
+              <w:t>Commits</w:t>
             </w:r>
           </w:p>
         </w:tc>
         <w:tc>
           <w:tcPr>
-            <w:tcW w:w="3923" w:type="dxa"/>
+            <w:tcW w:w="4954" w:type="dxa"/>
             <w:tcBorders/>
             <w:tcMar>
               <w:bottom w:w="0" w:type="dxa"/>
@@ -2523,7 +2216,7 @@
                 <w:szCs w:val="20"/>
                 <w:lang w:val="nl-NL" w:eastAsia="nl-NL" w:bidi="ar-SA"/>
               </w:rPr>
-              <w:t>ADRs + plan overleven sessies</w:t>
+              <w:t>418</w:t>
             </w:r>
           </w:p>
         </w:tc>
@@ -2532,7 +2225,7 @@
         <w:trPr/>
         <w:tc>
           <w:tcPr>
-            <w:tcW w:w="5433" w:type="dxa"/>
+            <w:tcW w:w="4402" w:type="dxa"/>
             <w:tcBorders/>
             <w:tcMar>
               <w:bottom w:w="0" w:type="dxa"/>
@@ -2556,29 +2249,18 @@
             <w:r>
               <w:rPr>
                 <w:rFonts w:eastAsia="Times New Roman" w:cs="Times New Roman"/>
-                <w:b/>
-                <w:kern w:val="0"/>
-                <w:sz w:val="18"/>
-                <w:szCs w:val="20"/>
-                <w:lang w:val="nl-NL" w:eastAsia="nl-NL" w:bidi="ar-SA"/>
-              </w:rPr>
-              <w:t>Regressies</w:t>
-            </w:r>
-            <w:r>
-              <w:rPr>
-                <w:rFonts w:eastAsia="Times New Roman" w:cs="Times New Roman"/>
-                <w:kern w:val="0"/>
-                <w:sz w:val="18"/>
-                <w:szCs w:val="20"/>
-                <w:lang w:val="nl-NL" w:eastAsia="nl-NL" w:bidi="ar-SA"/>
-              </w:rPr>
-              <w:t xml:space="preserve"> (AI breekt bestaande code)</w:t>
+                <w:kern w:val="0"/>
+                <w:sz w:val="18"/>
+                <w:szCs w:val="20"/>
+                <w:lang w:val="nl-NL" w:eastAsia="nl-NL" w:bidi="ar-SA"/>
+              </w:rPr>
+              <w:t>Testbestanden</w:t>
             </w:r>
           </w:p>
         </w:tc>
         <w:tc>
           <w:tcPr>
-            <w:tcW w:w="3923" w:type="dxa"/>
+            <w:tcW w:w="4954" w:type="dxa"/>
             <w:tcBorders/>
             <w:tcMar>
               <w:bottom w:w="0" w:type="dxa"/>
@@ -2607,7 +2289,7 @@
                 <w:szCs w:val="20"/>
                 <w:lang w:val="nl-NL" w:eastAsia="nl-NL" w:bidi="ar-SA"/>
               </w:rPr>
-              <w:t>Tests vangen regressies direct</w:t>
+              <w:t>187</w:t>
             </w:r>
           </w:p>
         </w:tc>
@@ -2616,7 +2298,7 @@
         <w:trPr/>
         <w:tc>
           <w:tcPr>
-            <w:tcW w:w="5433" w:type="dxa"/>
+            <w:tcW w:w="4402" w:type="dxa"/>
             <w:tcBorders/>
             <w:tcMar>
               <w:bottom w:w="0" w:type="dxa"/>
@@ -2640,29 +2322,18 @@
             <w:r>
               <w:rPr>
                 <w:rFonts w:eastAsia="Times New Roman" w:cs="Times New Roman"/>
-                <w:b/>
-                <w:kern w:val="0"/>
-                <w:sz w:val="18"/>
-                <w:szCs w:val="20"/>
-                <w:lang w:val="nl-NL" w:eastAsia="nl-NL" w:bidi="ar-SA"/>
-              </w:rPr>
-              <w:t>Inconsistentie</w:t>
-            </w:r>
-            <w:r>
-              <w:rPr>
-                <w:rFonts w:eastAsia="Times New Roman" w:cs="Times New Roman"/>
-                <w:kern w:val="0"/>
-                <w:sz w:val="18"/>
-                <w:szCs w:val="20"/>
-                <w:lang w:val="nl-NL" w:eastAsia="nl-NL" w:bidi="ar-SA"/>
-              </w:rPr>
-              <w:t xml:space="preserve"> (AI gebruikt andere patronen)</w:t>
+                <w:kern w:val="0"/>
+                <w:sz w:val="18"/>
+                <w:szCs w:val="20"/>
+                <w:lang w:val="nl-NL" w:eastAsia="nl-NL" w:bidi="ar-SA"/>
+              </w:rPr>
+              <w:t>Testfuncties</w:t>
             </w:r>
           </w:p>
         </w:tc>
         <w:tc>
           <w:tcPr>
-            <w:tcW w:w="3923" w:type="dxa"/>
+            <w:tcW w:w="4954" w:type="dxa"/>
             <w:tcBorders/>
             <w:tcMar>
               <w:bottom w:w="0" w:type="dxa"/>
@@ -2691,7 +2362,7 @@
                 <w:szCs w:val="20"/>
                 <w:lang w:val="nl-NL" w:eastAsia="nl-NL" w:bidi="ar-SA"/>
               </w:rPr>
-              <w:t>Plan + codebase scan afdwingen patronen</w:t>
+              <w:t>1091</w:t>
             </w:r>
           </w:p>
         </w:tc>
@@ -2700,7 +2371,7 @@
         <w:trPr/>
         <w:tc>
           <w:tcPr>
-            <w:tcW w:w="5433" w:type="dxa"/>
+            <w:tcW w:w="4402" w:type="dxa"/>
             <w:tcBorders/>
             <w:tcMar>
               <w:bottom w:w="0" w:type="dxa"/>
@@ -2724,29 +2395,18 @@
             <w:r>
               <w:rPr>
                 <w:rFonts w:eastAsia="Times New Roman" w:cs="Times New Roman"/>
-                <w:b/>
-                <w:kern w:val="0"/>
-                <w:sz w:val="18"/>
-                <w:szCs w:val="20"/>
-                <w:lang w:val="nl-NL" w:eastAsia="nl-NL" w:bidi="ar-SA"/>
-              </w:rPr>
-              <w:t>Scope creep</w:t>
-            </w:r>
-            <w:r>
-              <w:rPr>
-                <w:rFonts w:eastAsia="Times New Roman" w:cs="Times New Roman"/>
-                <w:kern w:val="0"/>
-                <w:sz w:val="18"/>
-                <w:szCs w:val="20"/>
-                <w:lang w:val="nl-NL" w:eastAsia="nl-NL" w:bidi="ar-SA"/>
-              </w:rPr>
-              <w:t xml:space="preserve"> (AI voegt features toe)</w:t>
+                <w:kern w:val="0"/>
+                <w:sz w:val="18"/>
+                <w:szCs w:val="20"/>
+                <w:lang w:val="nl-NL" w:eastAsia="nl-NL" w:bidi="ar-SA"/>
+              </w:rPr>
+              <w:t>ADRs</w:t>
             </w:r>
           </w:p>
         </w:tc>
         <w:tc>
           <w:tcPr>
-            <w:tcW w:w="3923" w:type="dxa"/>
+            <w:tcW w:w="4954" w:type="dxa"/>
             <w:tcBorders/>
             <w:tcMar>
               <w:bottom w:w="0" w:type="dxa"/>
@@ -2775,7 +2435,7 @@
                 <w:szCs w:val="20"/>
                 <w:lang w:val="nl-NL" w:eastAsia="nl-NL" w:bidi="ar-SA"/>
               </w:rPr>
-              <w:t>Plan met "Out of Scope" sectie</w:t>
+              <w:t>28</w:t>
             </w:r>
           </w:p>
         </w:tc>
@@ -2784,7 +2444,7 @@
         <w:trPr/>
         <w:tc>
           <w:tcPr>
-            <w:tcW w:w="5433" w:type="dxa"/>
+            <w:tcW w:w="4402" w:type="dxa"/>
             <w:tcBorders/>
             <w:tcMar>
               <w:bottom w:w="0" w:type="dxa"/>
@@ -2808,29 +2468,18 @@
             <w:r>
               <w:rPr>
                 <w:rFonts w:eastAsia="Times New Roman" w:cs="Times New Roman"/>
-                <w:b/>
-                <w:kern w:val="0"/>
-                <w:sz w:val="18"/>
-                <w:szCs w:val="20"/>
-                <w:lang w:val="nl-NL" w:eastAsia="nl-NL" w:bidi="ar-SA"/>
-              </w:rPr>
-              <w:t>Teruggedraaide beslissingen</w:t>
-            </w:r>
-            <w:r>
-              <w:rPr>
-                <w:rFonts w:eastAsia="Times New Roman" w:cs="Times New Roman"/>
-                <w:kern w:val="0"/>
-                <w:sz w:val="18"/>
-                <w:szCs w:val="20"/>
-                <w:lang w:val="nl-NL" w:eastAsia="nl-NL" w:bidi="ar-SA"/>
-              </w:rPr>
-              <w:t xml:space="preserve"> (AI "fixt" bewuste keuzes)</w:t>
+                <w:kern w:val="0"/>
+                <w:sz w:val="18"/>
+                <w:szCs w:val="20"/>
+                <w:lang w:val="nl-NL" w:eastAsia="nl-NL" w:bidi="ar-SA"/>
+              </w:rPr>
+              <w:t>Implementatieplannen</w:t>
             </w:r>
           </w:p>
         </w:tc>
         <w:tc>
           <w:tcPr>
-            <w:tcW w:w="3923" w:type="dxa"/>
+            <w:tcW w:w="4954" w:type="dxa"/>
             <w:tcBorders/>
             <w:tcMar>
               <w:bottom w:w="0" w:type="dxa"/>
@@ -2859,7 +2508,7 @@
                 <w:szCs w:val="20"/>
                 <w:lang w:val="nl-NL" w:eastAsia="nl-NL" w:bidi="ar-SA"/>
               </w:rPr>
-              <w:t>ADRs documenteren het *waarom*</w:t>
+              <w:t>19</w:t>
             </w:r>
           </w:p>
         </w:tc>
@@ -2868,7 +2517,7 @@
         <w:trPr/>
         <w:tc>
           <w:tcPr>
-            <w:tcW w:w="5433" w:type="dxa"/>
+            <w:tcW w:w="4402" w:type="dxa"/>
             <w:tcBorders/>
             <w:tcMar>
               <w:bottom w:w="0" w:type="dxa"/>
@@ -2892,29 +2541,18 @@
             <w:r>
               <w:rPr>
                 <w:rFonts w:eastAsia="Times New Roman" w:cs="Times New Roman"/>
-                <w:b/>
-                <w:kern w:val="0"/>
-                <w:sz w:val="18"/>
-                <w:szCs w:val="20"/>
-                <w:lang w:val="nl-NL" w:eastAsia="nl-NL" w:bidi="ar-SA"/>
-              </w:rPr>
-              <w:t>Dubbel werk</w:t>
-            </w:r>
-            <w:r>
-              <w:rPr>
-                <w:rFonts w:eastAsia="Times New Roman" w:cs="Times New Roman"/>
-                <w:kern w:val="0"/>
-                <w:sz w:val="18"/>
-                <w:szCs w:val="20"/>
-                <w:lang w:val="nl-NL" w:eastAsia="nl-NL" w:bidi="ar-SA"/>
-              </w:rPr>
-              <w:t xml:space="preserve"> (AI lost opgelost probleem opnieuw op)</w:t>
+                <w:kern w:val="0"/>
+                <w:sz w:val="18"/>
+                <w:szCs w:val="20"/>
+                <w:lang w:val="nl-NL" w:eastAsia="nl-NL" w:bidi="ar-SA"/>
+              </w:rPr>
+              <w:t>Tijdspanne</w:t>
             </w:r>
           </w:p>
         </w:tc>
         <w:tc>
           <w:tcPr>
-            <w:tcW w:w="3923" w:type="dxa"/>
+            <w:tcW w:w="4954" w:type="dxa"/>
             <w:tcBorders/>
             <w:tcMar>
               <w:bottom w:w="0" w:type="dxa"/>
@@ -2943,7 +2581,7 @@
                 <w:szCs w:val="20"/>
                 <w:lang w:val="nl-NL" w:eastAsia="nl-NL" w:bidi="ar-SA"/>
               </w:rPr>
-              <w:t>ADR-index geeft overzicht</w:t>
+              <w:t>3 weken</w:t>
             </w:r>
           </w:p>
         </w:tc>
@@ -2960,12 +2598,44 @@
     </w:p>
     <w:p>
       <w:pPr>
+        <w:pStyle w:val="Normal"/>
+        <w:rPr/>
+      </w:pPr>
+      <w:r>
+        <w:rPr/>
+        <w:t>Gebouwd met consistente architectuur ondanks tientallen sessiewisselingen.</w:t>
+      </w:r>
+    </w:p>
+    <w:p>
+      <w:pPr>
+        <w:pStyle w:val="Heading2"/>
+        <w:rPr/>
+      </w:pPr>
+      <w:r>
+        <w:rPr/>
+      </w:r>
+      <w:r>
+        <w:br w:type="page"/>
+      </w:r>
+    </w:p>
+    <w:p>
+      <w:pPr>
+        <w:pStyle w:val="Heading2"/>
+        <w:rPr/>
+      </w:pPr>
+      <w:r>
+        <w:rPr/>
+        <w:t>Deel 4: ANVIL; de vier lagen geautomatiseerd</w:t>
+      </w:r>
+    </w:p>
+    <w:p>
+      <w:pPr>
         <w:pStyle w:val="Heading3"/>
         <w:rPr/>
       </w:pPr>
       <w:r>
         <w:rPr/>
-        <w:t>Het belang van het *waarom*</w:t>
+        <w:t>Van handmatig naar georchestreerd</w:t>
       </w:r>
     </w:p>
     <w:p>
@@ -2975,7 +2645,7 @@
       </w:pPr>
       <w:r>
         <w:rPr/>
-        <w:t>De meest waardevolle informatie in een ADR is niet *wat* er is besloten, maar *waarom*. Vergelijk:</w:t>
+        <w:t>De vier lagen uit deel 2 werken, maar vereisen discipline: je moet zelf onthouden een PRD te schrijven, een plan te maken, TDD te volgen, en ADRs bij te houden. In de praktijk slipt dat; vooral onder tijdsdruk.</w:t>
       </w:r>
     </w:p>
     <w:p>
@@ -2987,21 +2657,21 @@
         <w:rPr>
           <w:b/>
         </w:rPr>
-        <w:t>Zonder ADR:</w:t>
-      </w:r>
-      <w:r>
-        <w:rPr/>
-        <w:t xml:space="preserve"> "attachments.activity_id heeft geen FK constraint"</w:t>
-      </w:r>
-    </w:p>
-    <w:p>
-      <w:pPr>
-        <w:pStyle w:val="ListParagraph"/>
-        <w:rPr/>
-      </w:pPr>
-      <w:r>
-        <w:rPr/>
-        <w:t>Volgende developer/AI: "Dat is een bug, laat me even een FK toevoegen..."</w:t>
+        <w:t>ANVIL</w:t>
+      </w:r>
+      <w:r>
+        <w:rPr/>
+        <w:t xml:space="preserve"> (Automated Nexus for Verified Iterative Lifecycles) is een skill voor Claude Code die deze flow probeert te automatiseren. Het is in actieve ontwikkeling en door mij gebouwd vanuit de lessen van het Mithril project.</w:t>
+      </w:r>
+    </w:p>
+    <w:p>
+      <w:pPr>
+        <w:pStyle w:val="Heading3"/>
+        <w:rPr/>
+      </w:pPr>
+      <w:r>
+        <w:rPr/>
+        <w:t>Hoe het werkt</w:t>
       </w:r>
     </w:p>
     <w:p>
@@ -3010,46 +2680,18 @@
         <w:rPr/>
       </w:pPr>
       <w:r>
-        <w:rPr>
-          <w:b/>
-        </w:rPr>
-        <w:t>Met ADR-019:</w:t>
-      </w:r>
-      <w:r>
-        <w:rPr/>
-        <w:t xml:space="preserve"> "FK bewust verwijderd zodat de cleanup command testbaar is en edge cases vangt"</w:t>
-      </w:r>
-    </w:p>
-    <w:p>
-      <w:pPr>
-        <w:pStyle w:val="ListParagraph"/>
-        <w:rPr/>
-      </w:pPr>
-      <w:r>
-        <w:rPr/>
-        <w:t>Volgende developer/AI: "Ah, dat is een bewuste keuze. Ik ga hier niet aankomen."</w:t>
-      </w:r>
-    </w:p>
-    <w:p>
-      <w:pPr>
-        <w:pStyle w:val="Heading2"/>
-        <w:rPr/>
-      </w:pPr>
-      <w:r>
-        <w:rPr/>
-      </w:r>
-      <w:r>
-        <w:br w:type="page"/>
-      </w:r>
-    </w:p>
-    <w:p>
-      <w:pPr>
-        <w:pStyle w:val="Heading2"/>
-        <w:rPr/>
-      </w:pPr>
-      <w:r>
-        <w:rPr/>
-        <w:t>Deel 6: Praktische tips &amp; valkuilen (10 min)</w:t>
+        <w:rPr/>
+        <w:t>ANVIL is een orchestrator die de volledige lifecycle aanstuurt via gespecialiseerde rollen:</w:t>
+      </w:r>
+    </w:p>
+    <w:p>
+      <w:pPr>
+        <w:pStyle w:val="Normal"/>
+        <w:rPr/>
+      </w:pPr>
+      <w:r>
+        <w:rPr/>
+        <w:t>Elke rol is een AI-agent met een specifieke opdracht en regels. De orchestrator stuurt ze aan, bewaakt de voortgang, en zorgt dat de gebruiker altijd de controle houdt.</w:t>
       </w:r>
     </w:p>
     <w:p>
@@ -3059,215 +2701,7 @@
       </w:pPr>
       <w:r>
         <w:rPr/>
-        <w:t>Valkuilen bij AI-assisted development</w:t>
-      </w:r>
-    </w:p>
-    <w:p>
-      <w:pPr>
-        <w:pStyle w:val="ListParagraph"/>
-        <w:rPr/>
-      </w:pPr>
-      <w:r>
-        <w:rPr>
-          <w:b/>
-        </w:rPr>
-        <w:t>"De AI weet het toch"</w:t>
-      </w:r>
-      <w:r>
-        <w:rPr/>
-        <w:t xml:space="preserve"> — Nee. Elke sessie begint leeg. Als het niet in een bestand staat, bestaat het niet.</w:t>
-      </w:r>
-    </w:p>
-    <w:p>
-      <w:pPr>
-        <w:pStyle w:val="ListParagraph"/>
-        <w:rPr/>
-      </w:pPr>
-      <w:r>
-        <w:rPr>
-          <w:b/>
-        </w:rPr>
-        <w:t>Grote sessies</w:t>
-      </w:r>
-      <w:r>
-        <w:rPr/>
-        <w:t xml:space="preserve"> — Context windows hebben limieten. Lange sessies leiden tot context compressie waarbij nuances verloren gaan. Kleine fases in het plan houden sessies beheersbaar.</w:t>
-      </w:r>
-    </w:p>
-    <w:p>
-      <w:pPr>
-        <w:pStyle w:val="ListParagraph"/>
-        <w:rPr/>
-      </w:pPr>
-      <w:r>
-        <w:rPr>
-          <w:b/>
-        </w:rPr>
-        <w:t>Geen tests = geen vangnet</w:t>
-      </w:r>
-      <w:r>
-        <w:rPr/>
-        <w:t xml:space="preserve"> — Zonder TDD merk je niet dat de AI in sessie 5 iets heeft gebroken dat in sessie 2 werkte.</w:t>
-      </w:r>
-    </w:p>
-    <w:p>
-      <w:pPr>
-        <w:pStyle w:val="ListParagraph"/>
-        <w:rPr/>
-      </w:pPr>
-      <w:r>
-        <w:rPr>
-          <w:b/>
-        </w:rPr>
-        <w:t>ADRs achteraf schrijven</w:t>
-      </w:r>
-      <w:r>
-        <w:rPr/>
-        <w:t xml:space="preserve"> — Dan mis je de alternatieven die je hebt overwogen. Schrijf ADRs op het moment van de beslissing.</w:t>
-      </w:r>
-    </w:p>
-    <w:p>
-      <w:pPr>
-        <w:pStyle w:val="ListParagraph"/>
-        <w:rPr/>
-      </w:pPr>
-      <w:r>
-        <w:rPr>
-          <w:b/>
-        </w:rPr>
-        <w:t>Plan niet bijwerken</w:t>
-      </w:r>
-      <w:r>
-        <w:rPr/>
-        <w:t xml:space="preserve"> — Een plan dat niet de werkelijkheid reflecteert is erger dan geen plan. Houd het actueel.</w:t>
-      </w:r>
-    </w:p>
-    <w:p>
-      <w:pPr>
-        <w:pStyle w:val="ListParagraph"/>
-        <w:rPr/>
-      </w:pPr>
-      <w:r>
-        <w:rPr>
-          <w:b/>
-        </w:rPr>
-        <w:t>AI blind vertrouwen</w:t>
-      </w:r>
-      <w:r>
-        <w:rPr/>
-        <w:t xml:space="preserve"> — De AI is een krachtig hulpmiddel, maar jij blijft de architect. Review, denk mee, stel vragen.</w:t>
-      </w:r>
-    </w:p>
-    <w:p>
-      <w:pPr>
-        <w:pStyle w:val="Heading3"/>
-        <w:rPr/>
-      </w:pPr>
-      <w:r>
-        <w:rPr/>
-        <w:t>Tips</w:t>
-      </w:r>
-    </w:p>
-    <w:p>
-      <w:pPr>
-        <w:pStyle w:val="ListParagraph"/>
-        <w:rPr/>
-      </w:pPr>
-      <w:r>
-        <w:rPr>
-          <w:b/>
-        </w:rPr>
-        <w:t>Start elke sessie met context laden</w:t>
-      </w:r>
-      <w:r>
-        <w:rPr/>
-        <w:t xml:space="preserve"> — In Mithril activeert `CLAUDE.md` automatisch `/bdk-tdd`, `/bdk-adr` en `/bdk-lemp` bij elke nieuwe chat. Dit kan met elke AI-assistant: geef hem bij de start de relevante bestanden.</w:t>
-      </w:r>
-    </w:p>
-    <w:p>
-      <w:pPr>
-        <w:pStyle w:val="ListParagraph"/>
-        <w:rPr/>
-      </w:pPr>
-      <w:r>
-        <w:rPr>
-          <w:b/>
-        </w:rPr>
-        <w:t>Maak specs testbaar</w:t>
-      </w:r>
-      <w:r>
-        <w:rPr/>
-        <w:t xml:space="preserve"> — Als je het niet in een test kunt uitdrukken, is de spec te vaag.</w:t>
-      </w:r>
-    </w:p>
-    <w:p>
-      <w:pPr>
-        <w:pStyle w:val="ListParagraph"/>
-        <w:rPr/>
-      </w:pPr>
-      <w:r>
-        <w:rPr>
-          <w:b/>
-        </w:rPr>
-        <w:t>Houd ADRs klein en focused</w:t>
-      </w:r>
-      <w:r>
-        <w:rPr/>
-        <w:t xml:space="preserve"> — Een ADR per beslissing, niet een mega-document per feature.</w:t>
-      </w:r>
-    </w:p>
-    <w:p>
-      <w:pPr>
-        <w:pStyle w:val="ListParagraph"/>
-        <w:rPr/>
-      </w:pPr>
-      <w:r>
-        <w:rPr>
-          <w:b/>
-        </w:rPr>
-        <w:t>Gebruik het plan als communicatiemiddel</w:t>
-      </w:r>
-      <w:r>
-        <w:rPr/>
-        <w:t xml:space="preserve"> — Het plan is niet alleen voor de AI — het is ook voor jou en je team. Een goedgekeurd plan voorkomt discussie tijdens implementatie.</w:t>
-      </w:r>
-    </w:p>
-    <w:p>
-      <w:pPr>
-        <w:pStyle w:val="ListParagraph"/>
-        <w:rPr/>
-      </w:pPr>
-      <w:r>
-        <w:rPr>
-          <w:b/>
-        </w:rPr>
-        <w:t>Externaliseer alles</w:t>
-      </w:r>
-      <w:r>
-        <w:rPr/>
-        <w:t xml:space="preserve"> — Context die alleen in je hoofd zit, is context die verloren gaat. Schrijf het op.</w:t>
-      </w:r>
-    </w:p>
-    <w:p>
-      <w:pPr>
-        <w:pStyle w:val="Heading2"/>
-        <w:rPr/>
-      </w:pPr>
-      <w:r>
-        <w:rPr/>
-      </w:r>
-      <w:r>
-        <w:br w:type="page"/>
-      </w:r>
-    </w:p>
-    <w:p>
-      <w:pPr>
-        <w:pStyle w:val="Heading2"/>
-        <w:rPr/>
-      </w:pPr>
-      <w:r>
-        <w:rPr/>
-        <w:t>Samenvatting</w:t>
+        <w:t>Zes rollen</w:t>
       </w:r>
     </w:p>
     <w:tbl>
@@ -3286,15 +2720,14 @@
         <w:tblLook w:val="04a0" w:noHBand="0" w:noVBand="1" w:firstColumn="1" w:lastRow="0" w:lastColumn="0" w:firstRow="1"/>
       </w:tblPr>
       <w:tblGrid>
-        <w:gridCol w:w="2059"/>
-        <w:gridCol w:w="4826"/>
-        <w:gridCol w:w="2471"/>
+        <w:gridCol w:w="1871"/>
+        <w:gridCol w:w="7485"/>
       </w:tblGrid>
       <w:tr>
         <w:trPr/>
         <w:tc>
           <w:tcPr>
-            <w:tcW w:w="2059" w:type="dxa"/>
+            <w:tcW w:w="1871" w:type="dxa"/>
             <w:tcBorders/>
             <w:shd w:color="auto" w:fill="958561" w:val="clear"/>
           </w:tcPr>
@@ -3323,13 +2756,13 @@
                 <w:szCs w:val="16"/>
                 <w:lang w:val="nl-NL" w:eastAsia="nl-NL" w:bidi="ar-SA"/>
               </w:rPr>
-              <w:t>Component</w:t>
+              <w:t>Rol</w:t>
             </w:r>
           </w:p>
         </w:tc>
         <w:tc>
           <w:tcPr>
-            <w:tcW w:w="4826" w:type="dxa"/>
+            <w:tcW w:w="7485" w:type="dxa"/>
             <w:tcBorders/>
             <w:shd w:color="auto" w:fill="958561" w:val="clear"/>
           </w:tcPr>
@@ -3358,42 +2791,7 @@
                 <w:szCs w:val="16"/>
                 <w:lang w:val="nl-NL" w:eastAsia="nl-NL" w:bidi="ar-SA"/>
               </w:rPr>
-              <w:t>Functie</w:t>
-            </w:r>
-          </w:p>
-        </w:tc>
-        <w:tc>
-          <w:tcPr>
-            <w:tcW w:w="2471" w:type="dxa"/>
-            <w:tcBorders/>
-            <w:shd w:color="auto" w:fill="958561" w:val="clear"/>
-          </w:tcPr>
-          <w:p>
-            <w:pPr>
-              <w:pStyle w:val="Normal"/>
-              <w:widowControl/>
-              <w:spacing w:before="0" w:after="240"/>
-              <w:contextualSpacing/>
-              <w:jc w:val="start"/>
-              <w:rPr>
-                <w:rFonts w:eastAsia="Times New Roman" w:cs="Times New Roman"/>
-                <w:kern w:val="0"/>
-                <w:sz w:val="18"/>
-                <w:szCs w:val="20"/>
-                <w:lang w:val="nl-NL" w:eastAsia="nl-NL" w:bidi="ar-SA"/>
-              </w:rPr>
-            </w:pPr>
-            <w:r>
-              <w:rPr>
-                <w:rFonts w:eastAsia="Times New Roman" w:cs="Times New Roman"/>
-                <w:b/>
-                <w:color w:val="FFFFFF"/>
-                <w:kern w:val="0"/>
-                <w:sz w:val="16"/>
-                <w:szCs w:val="16"/>
-                <w:lang w:val="nl-NL" w:eastAsia="nl-NL" w:bidi="ar-SA"/>
-              </w:rPr>
-              <w:t>Overleeft sessies?</w:t>
+              <w:t>Verantwoordelijkheid</w:t>
             </w:r>
           </w:p>
         </w:tc>
@@ -3402,7 +2800,7 @@
         <w:trPr/>
         <w:tc>
           <w:tcPr>
-            <w:tcW w:w="2059" w:type="dxa"/>
+            <w:tcW w:w="1871" w:type="dxa"/>
             <w:tcBorders/>
             <w:tcMar>
               <w:bottom w:w="0" w:type="dxa"/>
@@ -3432,13 +2830,13 @@
                 <w:szCs w:val="20"/>
                 <w:lang w:val="nl-NL" w:eastAsia="nl-NL" w:bidi="ar-SA"/>
               </w:rPr>
-              <w:t>TDD</w:t>
+              <w:t>Analyst</w:t>
             </w:r>
           </w:p>
         </w:tc>
         <w:tc>
           <w:tcPr>
-            <w:tcW w:w="4826" w:type="dxa"/>
+            <w:tcW w:w="7485" w:type="dxa"/>
             <w:tcBorders/>
             <w:tcMar>
               <w:bottom w:w="0" w:type="dxa"/>
@@ -3467,13 +2865,16 @@
                 <w:szCs w:val="20"/>
                 <w:lang w:val="nl-NL" w:eastAsia="nl-NL" w:bidi="ar-SA"/>
               </w:rPr>
-              <w:t>Beschrijft gedrag, vangt regressies</w:t>
+              <w:t>Haalt requirements op uit externe bronnen (bijv. Jira)</w:t>
             </w:r>
           </w:p>
         </w:tc>
+      </w:tr>
+      <w:tr>
+        <w:trPr/>
         <w:tc>
           <w:tcPr>
-            <w:tcW w:w="2471" w:type="dxa"/>
+            <w:tcW w:w="1871" w:type="dxa"/>
             <w:tcBorders/>
             <w:tcMar>
               <w:bottom w:w="0" w:type="dxa"/>
@@ -3497,21 +2898,19 @@
             <w:r>
               <w:rPr>
                 <w:rFonts w:eastAsia="Times New Roman" w:cs="Times New Roman"/>
-                <w:kern w:val="0"/>
-                <w:sz w:val="18"/>
-                <w:szCs w:val="20"/>
-                <w:lang w:val="nl-NL" w:eastAsia="nl-NL" w:bidi="ar-SA"/>
-              </w:rPr>
-              <w:t>Ja (tests in repo)</w:t>
+                <w:b/>
+                <w:kern w:val="0"/>
+                <w:sz w:val="18"/>
+                <w:szCs w:val="20"/>
+                <w:lang w:val="nl-NL" w:eastAsia="nl-NL" w:bidi="ar-SA"/>
+              </w:rPr>
+              <w:t>Specifier</w:t>
             </w:r>
           </w:p>
         </w:tc>
-      </w:tr>
-      <w:tr>
-        <w:trPr/>
         <w:tc>
           <w:tcPr>
-            <w:tcW w:w="2059" w:type="dxa"/>
+            <w:tcW w:w="7485" w:type="dxa"/>
             <w:tcBorders/>
             <w:tcMar>
               <w:bottom w:w="0" w:type="dxa"/>
@@ -3535,19 +2934,21 @@
             <w:r>
               <w:rPr>
                 <w:rFonts w:eastAsia="Times New Roman" w:cs="Times New Roman"/>
-                <w:b/>
-                <w:kern w:val="0"/>
-                <w:sz w:val="18"/>
-                <w:szCs w:val="20"/>
-                <w:lang w:val="nl-NL" w:eastAsia="nl-NL" w:bidi="ar-SA"/>
-              </w:rPr>
-              <w:t>ADR</w:t>
+                <w:kern w:val="0"/>
+                <w:sz w:val="18"/>
+                <w:szCs w:val="20"/>
+                <w:lang w:val="nl-NL" w:eastAsia="nl-NL" w:bidi="ar-SA"/>
+              </w:rPr>
+              <w:t>Schrijft en reviewt PRDs</w:t>
             </w:r>
           </w:p>
         </w:tc>
+      </w:tr>
+      <w:tr>
+        <w:trPr/>
         <w:tc>
           <w:tcPr>
-            <w:tcW w:w="4826" w:type="dxa"/>
+            <w:tcW w:w="1871" w:type="dxa"/>
             <w:tcBorders/>
             <w:tcMar>
               <w:bottom w:w="0" w:type="dxa"/>
@@ -3571,18 +2972,19 @@
             <w:r>
               <w:rPr>
                 <w:rFonts w:eastAsia="Times New Roman" w:cs="Times New Roman"/>
-                <w:kern w:val="0"/>
-                <w:sz w:val="18"/>
-                <w:szCs w:val="20"/>
-                <w:lang w:val="nl-NL" w:eastAsia="nl-NL" w:bidi="ar-SA"/>
-              </w:rPr>
-              <w:t>Documenteert beslissingen + waarom</w:t>
+                <w:b/>
+                <w:kern w:val="0"/>
+                <w:sz w:val="18"/>
+                <w:szCs w:val="20"/>
+                <w:lang w:val="nl-NL" w:eastAsia="nl-NL" w:bidi="ar-SA"/>
+              </w:rPr>
+              <w:t>Architect</w:t>
             </w:r>
           </w:p>
         </w:tc>
         <w:tc>
           <w:tcPr>
-            <w:tcW w:w="2471" w:type="dxa"/>
+            <w:tcW w:w="7485" w:type="dxa"/>
             <w:tcBorders/>
             <w:tcMar>
               <w:bottom w:w="0" w:type="dxa"/>
@@ -3611,7 +3013,7 @@
                 <w:szCs w:val="20"/>
                 <w:lang w:val="nl-NL" w:eastAsia="nl-NL" w:bidi="ar-SA"/>
               </w:rPr>
-              <w:t>Ja (markdown in repo)</w:t>
+              <w:t>Maakt implementatieplannen met fases en specs</w:t>
             </w:r>
           </w:p>
         </w:tc>
@@ -3620,7 +3022,7 @@
         <w:trPr/>
         <w:tc>
           <w:tcPr>
-            <w:tcW w:w="2059" w:type="dxa"/>
+            <w:tcW w:w="1871" w:type="dxa"/>
             <w:tcBorders/>
             <w:tcMar>
               <w:bottom w:w="0" w:type="dxa"/>
@@ -3650,13 +3052,13 @@
                 <w:szCs w:val="20"/>
                 <w:lang w:val="nl-NL" w:eastAsia="nl-NL" w:bidi="ar-SA"/>
               </w:rPr>
-              <w:t>PRD</w:t>
+              <w:t>Builder</w:t>
             </w:r>
           </w:p>
         </w:tc>
         <w:tc>
           <w:tcPr>
-            <w:tcW w:w="4826" w:type="dxa"/>
+            <w:tcW w:w="7485" w:type="dxa"/>
             <w:tcBorders/>
             <w:tcMar>
               <w:bottom w:w="0" w:type="dxa"/>
@@ -3685,13 +3087,16 @@
                 <w:szCs w:val="20"/>
                 <w:lang w:val="nl-NL" w:eastAsia="nl-NL" w:bidi="ar-SA"/>
               </w:rPr>
-              <w:t>Formaliseert feature-eisen en doelen</w:t>
+              <w:t>Bouwt via TDD (red-green-refactor), kan parallel werken in agent teams</w:t>
             </w:r>
           </w:p>
         </w:tc>
+      </w:tr>
+      <w:tr>
+        <w:trPr/>
         <w:tc>
           <w:tcPr>
-            <w:tcW w:w="2471" w:type="dxa"/>
+            <w:tcW w:w="1871" w:type="dxa"/>
             <w:tcBorders/>
             <w:tcMar>
               <w:bottom w:w="0" w:type="dxa"/>
@@ -3715,21 +3120,19 @@
             <w:r>
               <w:rPr>
                 <w:rFonts w:eastAsia="Times New Roman" w:cs="Times New Roman"/>
-                <w:kern w:val="0"/>
-                <w:sz w:val="18"/>
-                <w:szCs w:val="20"/>
-                <w:lang w:val="nl-NL" w:eastAsia="nl-NL" w:bidi="ar-SA"/>
-              </w:rPr>
-              <w:t>Ja (markdown in repo)</w:t>
+                <w:b/>
+                <w:kern w:val="0"/>
+                <w:sz w:val="18"/>
+                <w:szCs w:val="20"/>
+                <w:lang w:val="nl-NL" w:eastAsia="nl-NL" w:bidi="ar-SA"/>
+              </w:rPr>
+              <w:t>Auditor</w:t>
             </w:r>
           </w:p>
         </w:tc>
-      </w:tr>
-      <w:tr>
-        <w:trPr/>
         <w:tc>
           <w:tcPr>
-            <w:tcW w:w="2059" w:type="dxa"/>
+            <w:tcW w:w="7485" w:type="dxa"/>
             <w:tcBorders/>
             <w:tcMar>
               <w:bottom w:w="0" w:type="dxa"/>
@@ -3753,19 +3156,21 @@
             <w:r>
               <w:rPr>
                 <w:rFonts w:eastAsia="Times New Roman" w:cs="Times New Roman"/>
-                <w:b/>
-                <w:kern w:val="0"/>
-                <w:sz w:val="18"/>
-                <w:szCs w:val="20"/>
-                <w:lang w:val="nl-NL" w:eastAsia="nl-NL" w:bidi="ar-SA"/>
-              </w:rPr>
-              <w:t>Plan</w:t>
+                <w:kern w:val="0"/>
+                <w:sz w:val="18"/>
+                <w:szCs w:val="20"/>
+                <w:lang w:val="nl-NL" w:eastAsia="nl-NL" w:bidi="ar-SA"/>
+              </w:rPr>
+              <w:t>OWASP security scans op de codebase</w:t>
             </w:r>
           </w:p>
         </w:tc>
+      </w:tr>
+      <w:tr>
+        <w:trPr/>
         <w:tc>
           <w:tcPr>
-            <w:tcW w:w="4826" w:type="dxa"/>
+            <w:tcW w:w="1871" w:type="dxa"/>
             <w:tcBorders/>
             <w:tcMar>
               <w:bottom w:w="0" w:type="dxa"/>
@@ -3789,18 +3194,19 @@
             <w:r>
               <w:rPr>
                 <w:rFonts w:eastAsia="Times New Roman" w:cs="Times New Roman"/>
-                <w:kern w:val="0"/>
-                <w:sz w:val="18"/>
-                <w:szCs w:val="20"/>
-                <w:lang w:val="nl-NL" w:eastAsia="nl-NL" w:bidi="ar-SA"/>
-              </w:rPr>
-              <w:t>Definieert technische scope, fases, specs</w:t>
+                <w:b/>
+                <w:kern w:val="0"/>
+                <w:sz w:val="18"/>
+                <w:szCs w:val="20"/>
+                <w:lang w:val="nl-NL" w:eastAsia="nl-NL" w:bidi="ar-SA"/>
+              </w:rPr>
+              <w:t>Scribe</w:t>
             </w:r>
           </w:p>
         </w:tc>
         <w:tc>
           <w:tcPr>
-            <w:tcW w:w="2471" w:type="dxa"/>
+            <w:tcW w:w="7485" w:type="dxa"/>
             <w:tcBorders/>
             <w:tcMar>
               <w:bottom w:w="0" w:type="dxa"/>
@@ -3829,7 +3235,279 @@
                 <w:szCs w:val="20"/>
                 <w:lang w:val="nl-NL" w:eastAsia="nl-NL" w:bidi="ar-SA"/>
               </w:rPr>
-              <w:t>Ja (markdown in repo)</w:t>
+              <w:t>Genereert documenten vanuit de opgeleverde resultaten</w:t>
+            </w:r>
+          </w:p>
+        </w:tc>
+      </w:tr>
+    </w:tbl>
+    <w:p>
+      <w:pPr>
+        <w:pStyle w:val="Normal"/>
+        <w:rPr/>
+      </w:pPr>
+      <w:r>
+        <w:rPr/>
+      </w:r>
+    </w:p>
+    <w:p>
+      <w:pPr>
+        <w:pStyle w:val="Heading3"/>
+        <w:rPr/>
+      </w:pPr>
+      <w:r>
+        <w:rPr/>
+        <w:t>Automatische bewaking</w:t>
+      </w:r>
+    </w:p>
+    <w:p>
+      <w:pPr>
+        <w:pStyle w:val="Normal"/>
+        <w:rPr/>
+      </w:pPr>
+      <w:r>
+        <w:rPr/>
+        <w:t>Naast de rollen heeft ANVIL twee Claude Code hooks (PostToolUse) die real-time afdwingen wat anders op discipline leunt:</w:t>
+      </w:r>
+    </w:p>
+    <w:p>
+      <w:pPr>
+        <w:pStyle w:val="ListParagraph"/>
+        <w:rPr/>
+      </w:pPr>
+      <w:r>
+        <w:rPr>
+          <w:b/>
+        </w:rPr>
+        <w:t>TDD Enforce</w:t>
+      </w:r>
+      <w:r>
+        <w:rPr/>
+        <w:t>; waarschuwt direct wanneer je een bronbestand wijzigt zonder dat er testwijzigingen in de working tree staan. Je krijgt de melding op het moment van de edit, niet pas bij een commit. Dit dwingt de Red-Green volgorde af: eerst tests, dan implementatie.</w:t>
+      </w:r>
+    </w:p>
+    <w:p>
+      <w:pPr>
+        <w:pStyle w:val="ListParagraph"/>
+        <w:rPr/>
+      </w:pPr>
+      <w:r>
+        <w:rPr>
+          <w:b/>
+        </w:rPr>
+        <w:t>ADR Watch</w:t>
+      </w:r>
+      <w:r>
+        <w:rPr/>
+        <w:t>; waarschuwt wanneer een bestand wordt gewijzigd dat buiten het actieve plan valt. Voorkomt onbewuste scope creep.</w:t>
+      </w:r>
+    </w:p>
+    <w:p>
+      <w:pPr>
+        <w:pStyle w:val="Normal"/>
+        <w:rPr/>
+      </w:pPr>
+      <w:r>
+        <w:rPr/>
+        <w:t>Beide hooks zijn informatief (ze blokkeren niet) en worden automatisch geinstalleerd via `/anvil init` in `.claude/settings.local.json`.</w:t>
+      </w:r>
+    </w:p>
+    <w:p>
+      <w:pPr>
+        <w:pStyle w:val="Heading3"/>
+        <w:rPr/>
+      </w:pPr>
+      <w:r>
+        <w:rPr/>
+      </w:r>
+      <w:r>
+        <w:br w:type="page"/>
+      </w:r>
+    </w:p>
+    <w:p>
+      <w:pPr>
+        <w:pStyle w:val="Heading3"/>
+        <w:rPr/>
+      </w:pPr>
+      <w:r>
+        <w:rPr/>
+        <w:t>Hoe ANVIL context rot minimaliseert</w:t>
+      </w:r>
+    </w:p>
+    <w:p>
+      <w:pPr>
+        <w:pStyle w:val="Normal"/>
+        <w:rPr/>
+      </w:pPr>
+      <w:r>
+        <w:rPr/>
+        <w:t>De vier lagen uit deel 2 bestrijden context rot op documentniveau. ANVIL voegt daar drie mechanismen aan toe die specifiek op het *verval binnen en tussen sessies* gericht zijn:</w:t>
+      </w:r>
+    </w:p>
+    <w:p>
+      <w:pPr>
+        <w:pStyle w:val="Normal"/>
+        <w:rPr/>
+      </w:pPr>
+      <w:r>
+        <w:rPr>
+          <w:b/>
+        </w:rPr>
+        <w:t>1. State op disk, niet in het geheugen</w:t>
+      </w:r>
+    </w:p>
+    <w:p>
+      <w:pPr>
+        <w:pStyle w:val="Normal"/>
+        <w:rPr/>
+      </w:pPr>
+      <w:r>
+        <w:rPr/>
+        <w:t>ANVIL leidt de lifecycle state af uit bestanden: de status in een plan, de aanwezigheid van PRDs, de voortgang van fases. Niets hangt af van wat de AI "onthoudt". Wanneer een sessie eindigt (of het context window vol raakt), schrijft ANVIL een session handoff met de huidige taak, voltooide werk, en volgende stappen. De volgende sessie leest dat bestand en pikt het werk op alsof er geen onderbreking was.</w:t>
+      </w:r>
+    </w:p>
+    <w:p>
+      <w:pPr>
+        <w:pStyle w:val="Normal"/>
+        <w:rPr/>
+      </w:pPr>
+      <w:r>
+        <w:rPr>
+          <w:b/>
+        </w:rPr>
+        <w:t>2. Kleine, gefocuste agents</w:t>
+      </w:r>
+    </w:p>
+    <w:p>
+      <w:pPr>
+        <w:pStyle w:val="Normal"/>
+        <w:rPr/>
+      </w:pPr>
+      <w:r>
+        <w:rPr/>
+        <w:t>In plaats van een enkele AI-sessie die steeds langer wordt (en steeds meer vergeet), splitst ANVIL werk op in gespecialiseerde agents. Een Builder-agent krijgt alleen de specs voor zijn fase, de relevante ADRs, en de projectconventies. Zijn context window bevat precies wat hij nodig heeft; niet de volledige geschiedenis van het project. Dit voorkomt attention decay doordat elke agent een kort, gefocust window heeft. Een bijkomend voordeel: kleinere context windows betekenen minder tokens per agent-aanroep, wat de API-kosten drukt en de responstijd verkort. Agents werken sneller omdat ze minder tekst hoeven te verwerken en minder last hebben van ruis.</w:t>
+      </w:r>
+    </w:p>
+    <w:p>
+      <w:pPr>
+        <w:pStyle w:val="Normal"/>
+        <w:rPr/>
+      </w:pPr>
+      <w:r>
+        <w:rPr/>
+        <w:t>Een kanttekening: de orchestrator zelf accumuleert wel state gedurende de sessie; elke agent-dispatch, elk resultaat en elke gebruikersbeslissing vergroot zijn context. Bij complexe plannen met veel fases kan de orchestrator op termijn tegen dezelfde context-limieten aanlopen die de agents juist vermijden. Context management blijft dus wel belangrijk om te monitoren.</w:t>
+      </w:r>
+    </w:p>
+    <w:p>
+      <w:pPr>
+        <w:pStyle w:val="Normal"/>
+        <w:rPr/>
+      </w:pPr>
+      <w:r>
+        <w:rPr>
+          <w:b/>
+        </w:rPr>
+        <w:t>3. Mechanische bewaking vervangt geheugen</w:t>
+      </w:r>
+    </w:p>
+    <w:p>
+      <w:pPr>
+        <w:pStyle w:val="Normal"/>
+        <w:rPr/>
+      </w:pPr>
+      <w:r>
+        <w:rPr/>
+        <w:t>De twee hooks (TDD Enforce en ADR Watch) vangen fouten die ontstaan door context rot *op het moment dat ze gebeuren*. Als de AI halverwege een sessie vergeet dat er een actief plan is en buiten scope begint te werken, waarschuwt ADR Watch direct. Als de AI vergeet dat TDD verplicht is en implementatiecode schrijft zonder tests, grijpt TDD Enforce in. Dit zijn geen herinneringen die de AI kan vergeten; het zijn mechanische checks die onafhankelijk van de AI draaien.</w:t>
+      </w:r>
+    </w:p>
+    <w:tbl>
+      <w:tblPr>
+        <w:tblStyle w:val="Tabelraster"/>
+        <w:tblW w:w="9356" w:type="dxa"/>
+        <w:jc w:val="start"/>
+        <w:tblInd w:w="0" w:type="dxa"/>
+        <w:tblLayout w:type="fixed"/>
+        <w:tblCellMar>
+          <w:top w:w="0" w:type="dxa"/>
+          <w:start w:w="108" w:type="dxa"/>
+          <w:bottom w:w="85" w:type="dxa"/>
+          <w:end w:w="108" w:type="dxa"/>
+        </w:tblCellMar>
+        <w:tblLook w:val="04a0" w:noHBand="0" w:noVBand="1" w:firstColumn="1" w:lastRow="0" w:lastColumn="0" w:firstRow="1"/>
+      </w:tblPr>
+      <w:tblGrid>
+        <w:gridCol w:w="4172"/>
+        <w:gridCol w:w="5184"/>
+      </w:tblGrid>
+      <w:tr>
+        <w:trPr/>
+        <w:tc>
+          <w:tcPr>
+            <w:tcW w:w="4172" w:type="dxa"/>
+            <w:tcBorders/>
+            <w:shd w:color="auto" w:fill="958561" w:val="clear"/>
+          </w:tcPr>
+          <w:p>
+            <w:pPr>
+              <w:pStyle w:val="Normal"/>
+              <w:widowControl/>
+              <w:spacing w:before="0" w:after="240"/>
+              <w:contextualSpacing/>
+              <w:jc w:val="start"/>
+              <w:rPr>
+                <w:rFonts w:eastAsia="Times New Roman" w:cs="Times New Roman"/>
+                <w:kern w:val="0"/>
+                <w:sz w:val="18"/>
+                <w:szCs w:val="20"/>
+                <w:lang w:val="nl-NL" w:eastAsia="nl-NL" w:bidi="ar-SA"/>
+              </w:rPr>
+            </w:pPr>
+            <w:r>
+              <w:rPr>
+                <w:rFonts w:eastAsia="Times New Roman" w:cs="Times New Roman"/>
+                <w:b/>
+                <w:color w:val="FFFFFF"/>
+                <w:kern w:val="0"/>
+                <w:sz w:val="16"/>
+                <w:szCs w:val="16"/>
+                <w:lang w:val="nl-NL" w:eastAsia="nl-NL" w:bidi="ar-SA"/>
+              </w:rPr>
+              <w:t>Context rot probleem</w:t>
+            </w:r>
+          </w:p>
+        </w:tc>
+        <w:tc>
+          <w:tcPr>
+            <w:tcW w:w="5184" w:type="dxa"/>
+            <w:tcBorders/>
+            <w:shd w:color="auto" w:fill="958561" w:val="clear"/>
+          </w:tcPr>
+          <w:p>
+            <w:pPr>
+              <w:pStyle w:val="Normal"/>
+              <w:widowControl/>
+              <w:spacing w:before="0" w:after="240"/>
+              <w:contextualSpacing/>
+              <w:jc w:val="start"/>
+              <w:rPr>
+                <w:rFonts w:eastAsia="Times New Roman" w:cs="Times New Roman"/>
+                <w:kern w:val="0"/>
+                <w:sz w:val="18"/>
+                <w:szCs w:val="20"/>
+                <w:lang w:val="nl-NL" w:eastAsia="nl-NL" w:bidi="ar-SA"/>
+              </w:rPr>
+            </w:pPr>
+            <w:r>
+              <w:rPr>
+                <w:rFonts w:eastAsia="Times New Roman" w:cs="Times New Roman"/>
+                <w:b/>
+                <w:color w:val="FFFFFF"/>
+                <w:kern w:val="0"/>
+                <w:sz w:val="16"/>
+                <w:szCs w:val="16"/>
+                <w:lang w:val="nl-NL" w:eastAsia="nl-NL" w:bidi="ar-SA"/>
+              </w:rPr>
+              <w:t>ANVIL oplossing</w:t>
             </w:r>
           </w:p>
         </w:tc>
@@ -3838,7 +3516,7 @@
         <w:trPr/>
         <w:tc>
           <w:tcPr>
-            <w:tcW w:w="2059" w:type="dxa"/>
+            <w:tcW w:w="4172" w:type="dxa"/>
             <w:tcBorders/>
             <w:tcMar>
               <w:bottom w:w="0" w:type="dxa"/>
@@ -3862,19 +3540,18 @@
             <w:r>
               <w:rPr>
                 <w:rFonts w:eastAsia="Times New Roman" w:cs="Times New Roman"/>
-                <w:b/>
-                <w:kern w:val="0"/>
-                <w:sz w:val="18"/>
-                <w:szCs w:val="20"/>
-                <w:lang w:val="nl-NL" w:eastAsia="nl-NL" w:bidi="ar-SA"/>
-              </w:rPr>
-              <w:t>CLAUDE.md</w:t>
+                <w:kern w:val="0"/>
+                <w:sz w:val="18"/>
+                <w:szCs w:val="20"/>
+                <w:lang w:val="nl-NL" w:eastAsia="nl-NL" w:bidi="ar-SA"/>
+              </w:rPr>
+              <w:t>Sessiewissel verliest voortgang</w:t>
             </w:r>
           </w:p>
         </w:tc>
         <w:tc>
           <w:tcPr>
-            <w:tcW w:w="4826" w:type="dxa"/>
+            <w:tcW w:w="5184" w:type="dxa"/>
             <w:tcBorders/>
             <w:tcMar>
               <w:bottom w:w="0" w:type="dxa"/>
@@ -3903,13 +3580,16 @@
                 <w:szCs w:val="20"/>
                 <w:lang w:val="nl-NL" w:eastAsia="nl-NL" w:bidi="ar-SA"/>
               </w:rPr>
-              <w:t>Laadt context automatisch bij start</w:t>
+              <w:t>Session handoff + state op disk</w:t>
             </w:r>
           </w:p>
         </w:tc>
+      </w:tr>
+      <w:tr>
+        <w:trPr/>
         <w:tc>
           <w:tcPr>
-            <w:tcW w:w="2471" w:type="dxa"/>
+            <w:tcW w:w="4172" w:type="dxa"/>
             <w:tcBorders/>
             <w:tcMar>
               <w:bottom w:w="0" w:type="dxa"/>
@@ -3938,7 +3618,261 @@
                 <w:szCs w:val="20"/>
                 <w:lang w:val="nl-NL" w:eastAsia="nl-NL" w:bidi="ar-SA"/>
               </w:rPr>
-              <w:t>Ja (config in repo)</w:t>
+              <w:t>Lang window; attention decay</w:t>
+            </w:r>
+          </w:p>
+        </w:tc>
+        <w:tc>
+          <w:tcPr>
+            <w:tcW w:w="5184" w:type="dxa"/>
+            <w:tcBorders/>
+            <w:tcMar>
+              <w:bottom w:w="0" w:type="dxa"/>
+            </w:tcMar>
+          </w:tcPr>
+          <w:p>
+            <w:pPr>
+              <w:pStyle w:val="Normal"/>
+              <w:widowControl/>
+              <w:spacing w:before="0" w:after="240"/>
+              <w:contextualSpacing/>
+              <w:jc w:val="start"/>
+              <w:rPr>
+                <w:rFonts w:eastAsia="Times New Roman" w:cs="Times New Roman"/>
+                <w:kern w:val="0"/>
+                <w:sz w:val="18"/>
+                <w:szCs w:val="20"/>
+                <w:lang w:val="nl-NL" w:eastAsia="nl-NL" w:bidi="ar-SA"/>
+              </w:rPr>
+            </w:pPr>
+            <w:r>
+              <w:rPr>
+                <w:rFonts w:eastAsia="Times New Roman" w:cs="Times New Roman"/>
+                <w:kern w:val="0"/>
+                <w:sz w:val="18"/>
+                <w:szCs w:val="20"/>
+                <w:lang w:val="nl-NL" w:eastAsia="nl-NL" w:bidi="ar-SA"/>
+              </w:rPr>
+              <w:t>Kleine agents met gefocuste context</w:t>
+            </w:r>
+          </w:p>
+        </w:tc>
+      </w:tr>
+      <w:tr>
+        <w:trPr/>
+        <w:tc>
+          <w:tcPr>
+            <w:tcW w:w="4172" w:type="dxa"/>
+            <w:tcBorders/>
+            <w:tcMar>
+              <w:bottom w:w="0" w:type="dxa"/>
+            </w:tcMar>
+          </w:tcPr>
+          <w:p>
+            <w:pPr>
+              <w:pStyle w:val="Normal"/>
+              <w:widowControl/>
+              <w:spacing w:before="0" w:after="240"/>
+              <w:contextualSpacing/>
+              <w:jc w:val="start"/>
+              <w:rPr>
+                <w:rFonts w:eastAsia="Times New Roman" w:cs="Times New Roman"/>
+                <w:kern w:val="0"/>
+                <w:sz w:val="18"/>
+                <w:szCs w:val="20"/>
+                <w:lang w:val="nl-NL" w:eastAsia="nl-NL" w:bidi="ar-SA"/>
+              </w:rPr>
+            </w:pPr>
+            <w:r>
+              <w:rPr>
+                <w:rFonts w:eastAsia="Times New Roman" w:cs="Times New Roman"/>
+                <w:kern w:val="0"/>
+                <w:sz w:val="18"/>
+                <w:szCs w:val="20"/>
+                <w:lang w:val="nl-NL" w:eastAsia="nl-NL" w:bidi="ar-SA"/>
+              </w:rPr>
+              <w:t>AI vergeet eigen regels</w:t>
+            </w:r>
+          </w:p>
+        </w:tc>
+        <w:tc>
+          <w:tcPr>
+            <w:tcW w:w="5184" w:type="dxa"/>
+            <w:tcBorders/>
+            <w:tcMar>
+              <w:bottom w:w="0" w:type="dxa"/>
+            </w:tcMar>
+          </w:tcPr>
+          <w:p>
+            <w:pPr>
+              <w:pStyle w:val="Normal"/>
+              <w:widowControl/>
+              <w:spacing w:before="0" w:after="240"/>
+              <w:contextualSpacing/>
+              <w:jc w:val="start"/>
+              <w:rPr>
+                <w:rFonts w:eastAsia="Times New Roman" w:cs="Times New Roman"/>
+                <w:kern w:val="0"/>
+                <w:sz w:val="18"/>
+                <w:szCs w:val="20"/>
+                <w:lang w:val="nl-NL" w:eastAsia="nl-NL" w:bidi="ar-SA"/>
+              </w:rPr>
+            </w:pPr>
+            <w:r>
+              <w:rPr>
+                <w:rFonts w:eastAsia="Times New Roman" w:cs="Times New Roman"/>
+                <w:kern w:val="0"/>
+                <w:sz w:val="18"/>
+                <w:szCs w:val="20"/>
+                <w:lang w:val="nl-NL" w:eastAsia="nl-NL" w:bidi="ar-SA"/>
+              </w:rPr>
+              <w:t>Hooks die onafhankelijk van de AI draaien</w:t>
+            </w:r>
+          </w:p>
+        </w:tc>
+      </w:tr>
+      <w:tr>
+        <w:trPr/>
+        <w:tc>
+          <w:tcPr>
+            <w:tcW w:w="4172" w:type="dxa"/>
+            <w:tcBorders/>
+            <w:tcMar>
+              <w:bottom w:w="0" w:type="dxa"/>
+            </w:tcMar>
+          </w:tcPr>
+          <w:p>
+            <w:pPr>
+              <w:pStyle w:val="Normal"/>
+              <w:widowControl/>
+              <w:spacing w:before="0" w:after="240"/>
+              <w:contextualSpacing/>
+              <w:jc w:val="start"/>
+              <w:rPr>
+                <w:rFonts w:eastAsia="Times New Roman" w:cs="Times New Roman"/>
+                <w:kern w:val="0"/>
+                <w:sz w:val="18"/>
+                <w:szCs w:val="20"/>
+                <w:lang w:val="nl-NL" w:eastAsia="nl-NL" w:bidi="ar-SA"/>
+              </w:rPr>
+            </w:pPr>
+            <w:r>
+              <w:rPr>
+                <w:rFonts w:eastAsia="Times New Roman" w:cs="Times New Roman"/>
+                <w:kern w:val="0"/>
+                <w:sz w:val="18"/>
+                <w:szCs w:val="20"/>
+                <w:lang w:val="nl-NL" w:eastAsia="nl-NL" w:bidi="ar-SA"/>
+              </w:rPr>
+              <w:t>AI herhaalt afgewezen keuzes</w:t>
+            </w:r>
+          </w:p>
+        </w:tc>
+        <w:tc>
+          <w:tcPr>
+            <w:tcW w:w="5184" w:type="dxa"/>
+            <w:tcBorders/>
+            <w:tcMar>
+              <w:bottom w:w="0" w:type="dxa"/>
+            </w:tcMar>
+          </w:tcPr>
+          <w:p>
+            <w:pPr>
+              <w:pStyle w:val="Normal"/>
+              <w:widowControl/>
+              <w:spacing w:before="0" w:after="240"/>
+              <w:contextualSpacing/>
+              <w:jc w:val="start"/>
+              <w:rPr>
+                <w:rFonts w:eastAsia="Times New Roman" w:cs="Times New Roman"/>
+                <w:kern w:val="0"/>
+                <w:sz w:val="18"/>
+                <w:szCs w:val="20"/>
+                <w:lang w:val="nl-NL" w:eastAsia="nl-NL" w:bidi="ar-SA"/>
+              </w:rPr>
+            </w:pPr>
+            <w:r>
+              <w:rPr>
+                <w:rFonts w:eastAsia="Times New Roman" w:cs="Times New Roman"/>
+                <w:kern w:val="0"/>
+                <w:sz w:val="18"/>
+                <w:szCs w:val="20"/>
+                <w:lang w:val="nl-NL" w:eastAsia="nl-NL" w:bidi="ar-SA"/>
+              </w:rPr>
+              <w:t>ADRs geladen in elke agent prompt</w:t>
+            </w:r>
+          </w:p>
+        </w:tc>
+      </w:tr>
+      <w:tr>
+        <w:trPr/>
+        <w:tc>
+          <w:tcPr>
+            <w:tcW w:w="4172" w:type="dxa"/>
+            <w:tcBorders/>
+            <w:tcMar>
+              <w:bottom w:w="0" w:type="dxa"/>
+            </w:tcMar>
+          </w:tcPr>
+          <w:p>
+            <w:pPr>
+              <w:pStyle w:val="Normal"/>
+              <w:widowControl/>
+              <w:spacing w:before="0" w:after="240"/>
+              <w:contextualSpacing/>
+              <w:jc w:val="start"/>
+              <w:rPr>
+                <w:rFonts w:eastAsia="Times New Roman" w:cs="Times New Roman"/>
+                <w:kern w:val="0"/>
+                <w:sz w:val="18"/>
+                <w:szCs w:val="20"/>
+                <w:lang w:val="nl-NL" w:eastAsia="nl-NL" w:bidi="ar-SA"/>
+              </w:rPr>
+            </w:pPr>
+            <w:r>
+              <w:rPr>
+                <w:rFonts w:eastAsia="Times New Roman" w:cs="Times New Roman"/>
+                <w:kern w:val="0"/>
+                <w:sz w:val="18"/>
+                <w:szCs w:val="20"/>
+                <w:lang w:val="nl-NL" w:eastAsia="nl-NL" w:bidi="ar-SA"/>
+              </w:rPr>
+              <w:t>Scope creep door verdunde context</w:t>
+            </w:r>
+          </w:p>
+        </w:tc>
+        <w:tc>
+          <w:tcPr>
+            <w:tcW w:w="5184" w:type="dxa"/>
+            <w:tcBorders/>
+            <w:tcMar>
+              <w:bottom w:w="0" w:type="dxa"/>
+            </w:tcMar>
+          </w:tcPr>
+          <w:p>
+            <w:pPr>
+              <w:pStyle w:val="Normal"/>
+              <w:widowControl/>
+              <w:spacing w:before="0" w:after="240"/>
+              <w:contextualSpacing/>
+              <w:jc w:val="start"/>
+              <w:rPr>
+                <w:rFonts w:eastAsia="Times New Roman" w:cs="Times New Roman"/>
+                <w:kern w:val="0"/>
+                <w:sz w:val="18"/>
+                <w:szCs w:val="20"/>
+                <w:lang w:val="nl-NL" w:eastAsia="nl-NL" w:bidi="ar-SA"/>
+              </w:rPr>
+            </w:pPr>
+            <w:r>
+              <w:rPr>
+                <w:rFonts w:eastAsia="Times New Roman" w:cs="Times New Roman"/>
+                <w:kern w:val="0"/>
+                <w:sz w:val="18"/>
+                <w:szCs w:val="20"/>
+                <w:lang w:val="nl-NL" w:eastAsia="nl-NL" w:bidi="ar-SA"/>
+              </w:rPr>
+              <w:t>ADR Watch detecteert out-of-plan edits</w:t>
             </w:r>
           </w:p>
         </w:tc>
@@ -3955,12 +3889,44 @@
     </w:p>
     <w:p>
       <w:pPr>
+        <w:pStyle w:val="Heading3"/>
+        <w:rPr/>
+      </w:pPr>
+      <w:r>
+        <w:rPr/>
+      </w:r>
+      <w:r>
+        <w:br w:type="page"/>
+      </w:r>
+    </w:p>
+    <w:p>
+      <w:pPr>
+        <w:pStyle w:val="Heading3"/>
+        <w:rPr/>
+      </w:pPr>
+      <w:r>
+        <w:rPr/>
+        <w:t>De kern blijft</w:t>
+      </w:r>
+    </w:p>
+    <w:p>
+      <w:pPr>
         <w:pStyle w:val="Normal"/>
         <w:rPr/>
       </w:pPr>
       <w:r>
         <w:rPr/>
-        <w:t>De kracht zit in de combinatie: de PRD definieert *wat* er gebouwd moet worden en *waarom*, het plan vertaalt dat naar technische specs, TDD verifieert *dat* het correct is, en ADRs leggen vast *waarom* technische keuzes zijn gemaakt. Samen vormen ze een systeem dat context rot voorkomt en consistente, betrouwbare AI-assisted development mogelijk maakt.</w:t>
+        <w:t>ANVIL automatiseert de *flow*, maar de principes zijn dezelfde als in deel 2: PRDs, plannen, tests en beslissingen; vastgelegd in bestanden die elke sessie overleven. De tooling maakt het makkelijker om de discipline vol te houden, maar je kunt dezelfde aanpak toepassen met elk AI-hulpmiddel en een teksteditor.</w:t>
+      </w:r>
+    </w:p>
+    <w:p>
+      <w:pPr>
+        <w:pStyle w:val="Heading3"/>
+        <w:rPr/>
+      </w:pPr>
+      <w:r>
+        <w:rPr/>
+        <w:t>Zelf uitproberen</w:t>
       </w:r>
     </w:p>
     <w:p>
@@ -3969,14 +3935,8 @@
         <w:rPr/>
       </w:pPr>
       <w:r>
-        <w:rPr>
-          <w:b/>
-        </w:rPr>
-        <w:t>Mithril bewijst het:</w:t>
-      </w:r>
-      <w:r>
-        <w:rPr/>
-        <w:t xml:space="preserve"> 995 tests, 23 ADRs, 12 plannen, 318 commits — gebouwd in 3 weken, met consistente architectuur ondanks tientallen sessiewisselingen.</w:t>
+        <w:rPr/>
+        <w:t>ANVIL is op dit moment nog in actieve ontwikkeling, maar ik zal de skill binnenkort beschikbaar stellen voor iedereen binnen Proud Nerds die hem wil uitproberen. Houd er rekening mee dat het een Claude Code skill is; je hebt een werkende Claude Code setup nodig om ermee aan de slag te gaan.</w:t>
       </w:r>
     </w:p>
     <w:p>
@@ -3986,17 +3946,7 @@
       </w:pPr>
       <w:r>
         <w:rPr/>
-        <w:t>Discussie / Q&amp;A</w:t>
-      </w:r>
-    </w:p>
-    <w:p>
-      <w:pPr>
-        <w:pStyle w:val="Normal"/>
-        <w:rPr/>
-      </w:pPr>
-      <w:r>
-        <w:rPr/>
-        <w:t>Mogelijke discussiepunten:</w:t>
+        <w:t>Discussie / Q&amp;A (resterende tijd)</w:t>
       </w:r>
     </w:p>
     <w:p>
@@ -4016,17 +3966,7 @@
       </w:pPr>
       <w:r>
         <w:rPr/>
-        <w:t>Welke onderdelen zijn direct toepasbaar zonder AI?</w:t>
-      </w:r>
-    </w:p>
-    <w:p>
-      <w:pPr>
-        <w:pStyle w:val="ListParagraph"/>
-        <w:rPr/>
-      </w:pPr>
-      <w:r>
-        <w:rPr/>
-        <w:t>Hoe schaal je dit naar een team met meerdere developers?</w:t>
+        <w:t>Welke onderdelen zijn direct toepasbaar; ook zonder AI?</w:t>
       </w:r>
     </w:p>
     <w:p>
@@ -4125,7 +4065,18 @@
         <w:szCs w:val="18"/>
         <w:lang w:eastAsia="en-US"/>
       </w:rPr>
-      <w:t>Proud Nerds –  Vertrouwelijk</w:t>
+      <w:t>Workshop TDD, ADR &amp; AI-Assisted Development</w:t>
+    </w:r>
+    <w:r>
+      <w:rPr>
+        <w:rFonts w:eastAsia="Calibri"/>
+        <w:caps w:val="false"/>
+        <w:smallCaps w:val="false"/>
+        <w:color w:themeColor="background1" w:themeShade="80" w:val="808080"/>
+        <w:sz w:val="18"/>
+        <w:szCs w:val="18"/>
+        <w:lang w:eastAsia="en-US"/>
+      </w:rPr>
       <w:tab/>
       <w:tab/>
       <w:t xml:space="preserve">pagina </w:t>
@@ -4160,7 +4111,7 @@
         <w:sz w:val="18"/>
         <w:szCs w:val="18"/>
       </w:rPr>
-      <w:t>10</w:t>
+      <w:t>8</w:t>
     </w:r>
     <w:r>
       <w:rPr>
@@ -4208,7 +4159,7 @@
         <w:sz w:val="18"/>
         <w:szCs w:val="18"/>
       </w:rPr>
-      <w:t>10</w:t>
+      <w:t>8</w:t>
     </w:r>
     <w:r>
       <w:rPr>
@@ -4249,7 +4200,18 @@
         <w:szCs w:val="18"/>
         <w:lang w:eastAsia="en-US"/>
       </w:rPr>
-      <w:t>Proud Nerds –  Vertrouwelijk</w:t>
+      <w:t>Workshop TDD, ADR &amp; AI-Assisted Development</w:t>
+    </w:r>
+    <w:r>
+      <w:rPr>
+        <w:rFonts w:eastAsia="Calibri"/>
+        <w:caps w:val="false"/>
+        <w:smallCaps w:val="false"/>
+        <w:color w:themeColor="background1" w:themeShade="80" w:val="808080"/>
+        <w:sz w:val="18"/>
+        <w:szCs w:val="18"/>
+        <w:lang w:eastAsia="en-US"/>
+      </w:rPr>
       <w:tab/>
       <w:tab/>
       <w:t xml:space="preserve">pagina </w:t>
@@ -4284,7 +4246,7 @@
         <w:sz w:val="18"/>
         <w:szCs w:val="18"/>
       </w:rPr>
-      <w:t>10</w:t>
+      <w:t>8</w:t>
     </w:r>
     <w:r>
       <w:rPr>
@@ -4332,7 +4294,7 @@
         <w:sz w:val="18"/>
         <w:szCs w:val="18"/>
       </w:rPr>
-      <w:t>10</w:t>
+      <w:t>8</w:t>
     </w:r>
     <w:r>
       <w:rPr>
@@ -4385,7 +4347,11 @@
     </w:pPr>
     <w:r>
       <w:rPr/>
-      <w:t>Proud Nerds - vertrouwelijk</w:t>
+      <w:t xml:space="preserve">Proud Nerds - </w:t>
+    </w:r>
+    <w:r>
+      <w:rPr/>
+      <w:t>Bas de Kort</w:t>
     </w:r>
   </w:p>
 </w:hdr>
@@ -4414,7 +4380,11 @@
     </w:pPr>
     <w:r>
       <w:rPr/>
-      <w:t>Proud Nerds - vertrouwelijk</w:t>
+      <w:t xml:space="preserve">Proud Nerds - </w:t>
+    </w:r>
+    <w:r>
+      <w:rPr/>
+      <w:t>Bas de Kort</w:t>
     </w:r>
   </w:p>
 </w:hdr>

</xml_diff>